<commit_message>
doc: complemento com informacoes sobre como programar a central de alarmes no artigo
</commit_message>
<xml_diff>
--- a/docs/SAGE_PFC_v1.17.docx
+++ b/docs/SAGE_PFC_v1.17.docx
@@ -2674,14 +2674,6 @@
       </w:tr>
       <w:tr>
         <w:tblPrEx>
-          <w:tblBorders>
-            <w:top w:val="single" w:color="000000" w:sz="6" w:space="0"/>
-            <w:left w:val="single" w:color="000000" w:sz="6" w:space="0"/>
-            <w:bottom w:val="single" w:color="000000" w:sz="6" w:space="0"/>
-            <w:right w:val="single" w:color="000000" w:sz="6" w:space="0"/>
-            <w:insideH w:val="single" w:color="000000" w:sz="6" w:space="0"/>
-            <w:insideV w:val="single" w:color="000000" w:sz="6" w:space="0"/>
-          </w:tblBorders>
           <w:tblCellMar>
             <w:top w:w="0" w:type="dxa"/>
             <w:left w:w="10" w:type="dxa"/>
@@ -2846,13 +2838,8 @@
       <w:pPr>
         <w:pStyle w:val="17"/>
         <w:tabs>
-          <w:tab w:val="right" w:leader="dot" w:pos="9062"/>
+          <w:tab w:val="right" w:leader="dot" w:pos="9072"/>
         </w:tabs>
-        <w:rPr>
-          <w:rFonts w:asciiTheme="minorHAnsi" w:hAnsiTheme="minorHAnsi" w:eastAsiaTheme="minorEastAsia" w:cstheme="minorBidi"/>
-          <w:bCs w:val="0"/>
-          <w:sz w:val="22"/>
-        </w:rPr>
       </w:pPr>
       <w:r>
         <w:fldChar w:fldCharType="begin"/>
@@ -2867,16 +2854,13 @@
         <w:fldChar w:fldCharType="begin"/>
       </w:r>
       <w:r>
-        <w:instrText xml:space="preserve"> HYPERLINK \l "_Toc208903633" </w:instrText>
+        <w:instrText xml:space="preserve"> HYPERLINK \l _Toc27338 </w:instrText>
       </w:r>
       <w:r>
         <w:fldChar w:fldCharType="separate"/>
       </w:r>
       <w:r>
-        <w:rPr>
-          <w:rStyle w:val="11"/>
-        </w:rPr>
-        <w:t>FIGURA 1 - Central de Alarmes Monitorada Active Full 32</w:t>
+        <w:t>FIGURA 1  - Central de Alarmes Monitorada Active Full 32</w:t>
       </w:r>
       <w:r>
         <w:tab/>
@@ -2885,13 +2869,13 @@
         <w:fldChar w:fldCharType="begin"/>
       </w:r>
       <w:r>
-        <w:instrText xml:space="preserve"> PAGEREF _Toc208903633 \h </w:instrText>
+        <w:instrText xml:space="preserve"> PAGEREF _Toc27338 \h </w:instrText>
       </w:r>
       <w:r>
         <w:fldChar w:fldCharType="separate"/>
       </w:r>
       <w:r>
-        <w:t>22</w:t>
+        <w:t>26</w:t>
       </w:r>
       <w:r>
         <w:fldChar w:fldCharType="end"/>
@@ -2904,28 +2888,34 @@
       <w:pPr>
         <w:pStyle w:val="17"/>
         <w:tabs>
-          <w:tab w:val="right" w:leader="dot" w:pos="9062"/>
+          <w:tab w:val="right" w:leader="dot" w:pos="9072"/>
         </w:tabs>
-        <w:rPr>
-          <w:rFonts w:asciiTheme="minorHAnsi" w:hAnsiTheme="minorHAnsi" w:eastAsiaTheme="minorEastAsia" w:cstheme="minorBidi"/>
-          <w:bCs w:val="0"/>
-          <w:sz w:val="22"/>
-        </w:rPr>
       </w:pPr>
       <w:r>
         <w:fldChar w:fldCharType="begin"/>
       </w:r>
       <w:r>
-        <w:instrText xml:space="preserve"> HYPERLINK \l "_Toc208903634" </w:instrText>
+        <w:instrText xml:space="preserve"> HYPERLINK \l _Toc27425 </w:instrText>
       </w:r>
       <w:r>
         <w:fldChar w:fldCharType="separate"/>
       </w:r>
       <w:r>
         <w:rPr>
-          <w:rStyle w:val="11"/>
-        </w:rPr>
-        <w:t>FIGURA 2 – Integração dos componentes dentro do Sage</w:t>
+          <w:rFonts w:hint="default"/>
+          <w:lang w:val="pt-BR"/>
+        </w:rPr>
+        <w:t>FIGURA</w:t>
+      </w:r>
+      <w:r>
+        <w:t xml:space="preserve"> 2 </w:t>
+      </w:r>
+      <w:r>
+        <w:rPr>
+          <w:rFonts w:hint="default"/>
+          <w:lang w:val="pt-BR"/>
+        </w:rPr>
+        <w:t xml:space="preserve"> - Programador JFL Mob</w:t>
       </w:r>
       <w:r>
         <w:tab/>
@@ -2934,13 +2924,13 @@
         <w:fldChar w:fldCharType="begin"/>
       </w:r>
       <w:r>
-        <w:instrText xml:space="preserve"> PAGEREF _Toc208903634 \h </w:instrText>
+        <w:instrText xml:space="preserve"> PAGEREF _Toc27425 \h </w:instrText>
       </w:r>
       <w:r>
         <w:fldChar w:fldCharType="separate"/>
       </w:r>
       <w:r>
-        <w:t>30</w:t>
+        <w:t>34</w:t>
       </w:r>
       <w:r>
         <w:fldChar w:fldCharType="end"/>
@@ -2953,41 +2943,34 @@
       <w:pPr>
         <w:pStyle w:val="17"/>
         <w:tabs>
-          <w:tab w:val="right" w:leader="dot" w:pos="9062"/>
+          <w:tab w:val="right" w:leader="dot" w:pos="9072"/>
         </w:tabs>
-        <w:rPr>
-          <w:rFonts w:asciiTheme="minorHAnsi" w:hAnsiTheme="minorHAnsi" w:eastAsiaTheme="minorEastAsia" w:cstheme="minorBidi"/>
-          <w:bCs w:val="0"/>
-          <w:sz w:val="22"/>
-        </w:rPr>
       </w:pPr>
       <w:r>
         <w:fldChar w:fldCharType="begin"/>
       </w:r>
       <w:r>
-        <w:instrText xml:space="preserve"> HYPERLINK \l "_Toc208903635" </w:instrText>
+        <w:instrText xml:space="preserve"> HYPERLINK \l _Toc17565 </w:instrText>
       </w:r>
       <w:r>
         <w:fldChar w:fldCharType="separate"/>
       </w:r>
       <w:r>
         <w:rPr>
-          <w:rStyle w:val="11"/>
-        </w:rPr>
-        <w:t xml:space="preserve">FIGURA 3 - </w:t>
-      </w:r>
-      <w:r>
-        <w:rPr>
-          <w:rStyle w:val="11"/>
-          <w:i/>
-        </w:rPr>
-        <w:t xml:space="preserve">Backlog </w:t>
-      </w:r>
-      <w:r>
-        <w:rPr>
-          <w:rStyle w:val="11"/>
-        </w:rPr>
-        <w:t>do projeto cadastrado no Jira</w:t>
+          <w:rFonts w:hint="default"/>
+          <w:lang w:val="pt-BR"/>
+        </w:rPr>
+        <w:t>FIGURA</w:t>
+      </w:r>
+      <w:r>
+        <w:t xml:space="preserve"> 3 </w:t>
+      </w:r>
+      <w:r>
+        <w:rPr>
+          <w:rFonts w:hint="default"/>
+          <w:lang w:val="pt-BR"/>
+        </w:rPr>
+        <w:t xml:space="preserve"> - Configurando as credenciais da rede</w:t>
       </w:r>
       <w:r>
         <w:tab/>
@@ -2996,7 +2979,7 @@
         <w:fldChar w:fldCharType="begin"/>
       </w:r>
       <w:r>
-        <w:instrText xml:space="preserve"> PAGEREF _Toc208903635 \h </w:instrText>
+        <w:instrText xml:space="preserve"> PAGEREF _Toc17565 \h </w:instrText>
       </w:r>
       <w:r>
         <w:fldChar w:fldCharType="separate"/>
@@ -3015,28 +2998,34 @@
       <w:pPr>
         <w:pStyle w:val="17"/>
         <w:tabs>
-          <w:tab w:val="right" w:leader="dot" w:pos="9062"/>
+          <w:tab w:val="right" w:leader="dot" w:pos="9072"/>
         </w:tabs>
-        <w:rPr>
-          <w:rFonts w:asciiTheme="minorHAnsi" w:hAnsiTheme="minorHAnsi" w:eastAsiaTheme="minorEastAsia" w:cstheme="minorBidi"/>
-          <w:bCs w:val="0"/>
-          <w:sz w:val="22"/>
-        </w:rPr>
       </w:pPr>
       <w:r>
         <w:fldChar w:fldCharType="begin"/>
       </w:r>
       <w:r>
-        <w:instrText xml:space="preserve"> HYPERLINK \l "_Toc208903636" </w:instrText>
+        <w:instrText xml:space="preserve"> HYPERLINK \l _Toc29843 </w:instrText>
       </w:r>
       <w:r>
         <w:fldChar w:fldCharType="separate"/>
       </w:r>
       <w:r>
         <w:rPr>
-          <w:rStyle w:val="11"/>
-        </w:rPr>
-        <w:t>FIGURA 4 - Repositório no Github</w:t>
+          <w:rFonts w:hint="default"/>
+          <w:lang w:val="pt-BR"/>
+        </w:rPr>
+        <w:t xml:space="preserve">FIGURA </w:t>
+      </w:r>
+      <w:r>
+        <w:t xml:space="preserve">4 </w:t>
+      </w:r>
+      <w:r>
+        <w:rPr>
+          <w:rFonts w:hint="default"/>
+          <w:lang w:val="pt-BR"/>
+        </w:rPr>
+        <w:t xml:space="preserve"> - Configurando o IP e Porta do SAGE</w:t>
       </w:r>
       <w:r>
         <w:tab/>
@@ -3045,13 +3034,145 @@
         <w:fldChar w:fldCharType="begin"/>
       </w:r>
       <w:r>
-        <w:instrText xml:space="preserve"> PAGEREF _Toc208903636 \h </w:instrText>
+        <w:instrText xml:space="preserve"> PAGEREF _Toc29843 \h </w:instrText>
       </w:r>
       <w:r>
         <w:fldChar w:fldCharType="separate"/>
       </w:r>
       <w:r>
-        <w:t>41</w:t>
+        <w:t>35</w:t>
+      </w:r>
+      <w:r>
+        <w:fldChar w:fldCharType="end"/>
+      </w:r>
+      <w:r>
+        <w:fldChar w:fldCharType="end"/>
+      </w:r>
+    </w:p>
+    <w:p>
+      <w:pPr>
+        <w:pStyle w:val="17"/>
+        <w:tabs>
+          <w:tab w:val="right" w:leader="dot" w:pos="9072"/>
+        </w:tabs>
+      </w:pPr>
+      <w:r>
+        <w:fldChar w:fldCharType="begin"/>
+      </w:r>
+      <w:r>
+        <w:instrText xml:space="preserve"> HYPERLINK \l _Toc2051 </w:instrText>
+      </w:r>
+      <w:r>
+        <w:fldChar w:fldCharType="separate"/>
+      </w:r>
+      <w:r>
+        <w:t>FIGURA 5  – Integração dos componentes dentro do Sage</w:t>
+      </w:r>
+      <w:r>
+        <w:tab/>
+      </w:r>
+      <w:r>
+        <w:fldChar w:fldCharType="begin"/>
+      </w:r>
+      <w:r>
+        <w:instrText xml:space="preserve"> PAGEREF _Toc2051 \h </w:instrText>
+      </w:r>
+      <w:r>
+        <w:fldChar w:fldCharType="separate"/>
+      </w:r>
+      <w:r>
+        <w:t>36</w:t>
+      </w:r>
+      <w:r>
+        <w:fldChar w:fldCharType="end"/>
+      </w:r>
+      <w:r>
+        <w:fldChar w:fldCharType="end"/>
+      </w:r>
+    </w:p>
+    <w:p>
+      <w:pPr>
+        <w:pStyle w:val="17"/>
+        <w:tabs>
+          <w:tab w:val="right" w:leader="dot" w:pos="9072"/>
+        </w:tabs>
+      </w:pPr>
+      <w:r>
+        <w:fldChar w:fldCharType="begin"/>
+      </w:r>
+      <w:r>
+        <w:instrText xml:space="preserve"> HYPERLINK \l _Toc25011 </w:instrText>
+      </w:r>
+      <w:r>
+        <w:fldChar w:fldCharType="separate"/>
+      </w:r>
+      <w:r>
+        <w:t xml:space="preserve">FIGURA 6  - </w:t>
+      </w:r>
+      <w:r>
+        <w:rPr>
+          <w:i/>
+        </w:rPr>
+        <w:t xml:space="preserve">Backlog </w:t>
+      </w:r>
+      <w:r>
+        <w:t>do projeto cadastrado no Jira</w:t>
+      </w:r>
+      <w:r>
+        <w:tab/>
+      </w:r>
+      <w:r>
+        <w:fldChar w:fldCharType="begin"/>
+      </w:r>
+      <w:r>
+        <w:instrText xml:space="preserve"> PAGEREF _Toc25011 \h </w:instrText>
+      </w:r>
+      <w:r>
+        <w:fldChar w:fldCharType="separate"/>
+      </w:r>
+      <w:r>
+        <w:t>40</w:t>
+      </w:r>
+      <w:r>
+        <w:fldChar w:fldCharType="end"/>
+      </w:r>
+      <w:r>
+        <w:fldChar w:fldCharType="end"/>
+      </w:r>
+    </w:p>
+    <w:p>
+      <w:pPr>
+        <w:pStyle w:val="17"/>
+        <w:tabs>
+          <w:tab w:val="right" w:leader="dot" w:pos="9072"/>
+        </w:tabs>
+      </w:pPr>
+      <w:r>
+        <w:fldChar w:fldCharType="begin"/>
+      </w:r>
+      <w:r>
+        <w:instrText xml:space="preserve"> HYPERLINK \l _Toc30161 </w:instrText>
+      </w:r>
+      <w:r>
+        <w:fldChar w:fldCharType="separate"/>
+      </w:r>
+      <w:r>
+        <w:t>FIGURA 7  - Repositório no Github</w:t>
+      </w:r>
+      <w:r>
+        <w:tab/>
+      </w:r>
+      <w:r>
+        <w:fldChar w:fldCharType="begin"/>
+      </w:r>
+      <w:r>
+        <w:instrText xml:space="preserve"> PAGEREF _Toc30161 \h </w:instrText>
+      </w:r>
+      <w:r>
+        <w:fldChar w:fldCharType="separate"/>
+      </w:r>
+      <w:r>
+        <w:t>47</w:t>
       </w:r>
       <w:r>
         <w:fldChar w:fldCharType="end"/>
@@ -8533,7 +8654,6 @@
       <w:pPr>
         <w:pStyle w:val="24"/>
       </w:pPr>
-      <w:bookmarkStart w:id="7" w:name="_Toc208903633"/>
       <w:r>
         <w:t xml:space="preserve">FIGURA </w:t>
       </w:r>
@@ -8552,6 +8672,7 @@
       <w:r>
         <w:fldChar w:fldCharType="end"/>
       </w:r>
+      <w:bookmarkStart w:id="7" w:name="_Toc27338"/>
       <w:r>
         <w:t xml:space="preserve"> - Central de Alarmes Monitorada Active Full 32</w:t>
       </w:r>
@@ -9812,25 +9933,7 @@
         </w:numPr>
       </w:pPr>
       <w:r>
-        <w:t xml:space="preserve">desenvolver o componente da API para prover os serviços requeridos pelos aplicativos </w:t>
-      </w:r>
-      <w:r>
-        <w:rPr>
-          <w:i/>
-        </w:rPr>
-        <w:t xml:space="preserve">Web </w:t>
-      </w:r>
-      <w:r>
-        <w:t xml:space="preserve">e </w:t>
-      </w:r>
-      <w:r>
-        <w:rPr>
-          <w:i/>
-        </w:rPr>
-        <w:t>mobile</w:t>
-      </w:r>
-      <w:r>
-        <w:t>;</w:t>
+        <w:t>desenvolver o componente da API para prover os serviços requeridos pelo aplicativo;</w:t>
       </w:r>
     </w:p>
     <w:p>
@@ -9863,16 +9966,7 @@
         </w:numPr>
       </w:pPr>
       <w:r>
-        <w:t xml:space="preserve">desenvolver o componente para aplicativo </w:t>
-      </w:r>
-      <w:r>
-        <w:rPr>
-          <w:i/>
-        </w:rPr>
-        <w:t>mobile</w:t>
-      </w:r>
-      <w:r>
-        <w:t xml:space="preserve"> para aprimorar o acesso remoto aos responsáveis;</w:t>
+        <w:t>desenvolver a integração desses componentes de software junto à API e aos dispositivos de hardware digitais;</w:t>
       </w:r>
     </w:p>
     <w:p>
@@ -9884,7 +9978,7 @@
         </w:numPr>
       </w:pPr>
       <w:r>
-        <w:t>desenvolver a integração desses componentes de software junto à API e aos dispositivos de hardware digitais;</w:t>
+        <w:t>testar o sistema com base em casos de uso simulados, verificando sua eficácia;</w:t>
       </w:r>
     </w:p>
     <w:p>
@@ -9896,7 +9990,7 @@
         </w:numPr>
       </w:pPr>
       <w:r>
-        <w:t>testar o sistema com base em casos de uso simulados, verificando sua eficácia;</w:t>
+        <w:t>desenvolver o sistema de software com usabilidade e tecnologias que possibilitem sua futura escalabilidade e integração com outros sistemas;</w:t>
       </w:r>
     </w:p>
     <w:p>
@@ -9908,35 +10002,22 @@
         </w:numPr>
       </w:pPr>
       <w:r>
-        <w:t>desenvolver o sistema de software com usabilidade e tecnologias que possibilitem sua futura escalabilidade e integração com outros sistemas;</w:t>
+        <w:t>avaliar os benefícios da solução proposta em termos de melhoria da solicitação de cuidados de enfermagem;</w:t>
       </w:r>
     </w:p>
     <w:p>
       <w:pPr>
         <w:pStyle w:val="37"/>
         <w:numPr>
-          <w:ilvl w:val="0"/>
-          <w:numId w:val="3"/>
+          <w:numId w:val="0"/>
         </w:numPr>
-      </w:pPr>
-      <w:r>
-        <w:t>avaliar os benefícios da solução proposta em termos de melhoria da solicitação de cuidados de enfermagem;</w:t>
-      </w:r>
-    </w:p>
-    <w:p>
-      <w:pPr>
-        <w:pStyle w:val="37"/>
         <w:tabs>
           <w:tab w:val="left" w:pos="425"/>
         </w:tabs>
-        <w:ind w:left="0"/>
-      </w:pPr>
-      <w:r>
-        <w:rPr>
-          <w:highlight w:val="yellow"/>
-        </w:rPr>
-        <w:t>/*Atualizar os objetivos nos slides da apresentação conforme acertados aqui */</w:t>
-      </w:r>
+        <w:spacing w:after="240" w:line="360" w:lineRule="auto"/>
+        <w:contextualSpacing/>
+        <w:jc w:val="both"/>
+      </w:pPr>
     </w:p>
     <w:p>
       <w:pPr>
@@ -9986,22 +10067,96 @@
       </w:r>
     </w:p>
     <w:p>
-      <w:r>
-        <w:t xml:space="preserve">O manual da Active Full 32 especifica que a central comporta até 99 usuários, o que permitirá, no contexto deste projeto, atender até 99 unidades habitacionais da ILPI. Para isso, será cadastrado na central um controle remoto para cada unidade habitacional existente na instituição. Será possível, por meio da programação da central, renomear cada usuário para realizar a identificação correta de unidade. Cada unidade habitacional terá um controle remoto, que ao ser acionado enviará um sinal de radiofrequência 868 MHz para a central de alarmes. A central ficará posicionada de tal forma que permita o alcance a todas as unidades habitacionais, ou seja, no centro. </w:t>
-      </w:r>
-    </w:p>
-    <w:p>
-      <w:r>
-        <w:t>O equipamento enviará para a aplicação o sinal de radiofrequência, de acordo com o protocolo fornecido pela JFL Alarmes. A Figura 2 ilustra a integração dos componentes.</w:t>
-      </w:r>
-    </w:p>
-    <w:p>
-      <w:r>
+      <w:pPr>
+        <w:rPr>
+          <w:rFonts w:hint="default"/>
+        </w:rPr>
+      </w:pPr>
+      <w:r>
+        <w:rPr>
+          <w:rFonts w:hint="default"/>
+        </w:rPr>
+        <w:t>O manual da Active Full 32 especifica que a central comporta até 99 usuários, o que permitirá, no contexto deste projeto, atender até 99 unidades habitacionais da ILPI. Para isso, será cadastrado na central um controle remoto para cada unidade habitacional existente na instituição. Por meio da programação da central, será possível renomear cada usuário, de forma a identificar corretamente a respectiva unidade.</w:t>
+      </w:r>
+    </w:p>
+    <w:p>
+      <w:pPr>
+        <w:rPr>
+          <w:rFonts w:hint="default"/>
+        </w:rPr>
+      </w:pPr>
+      <w:r>
+        <w:rPr>
+          <w:rFonts w:hint="default"/>
+          <w:lang w:val="pt-BR"/>
+        </w:rPr>
+        <w:t xml:space="preserve">Além disso, </w:t>
+      </w:r>
+      <w:r>
+        <w:rPr>
+          <w:rFonts w:hint="default"/>
+        </w:rPr>
+        <w:t xml:space="preserve">será necessário programar no equipamento </w:t>
+      </w:r>
+      <w:r>
+        <w:rPr>
+          <w:rFonts w:hint="default"/>
+          <w:lang w:val="pt-BR"/>
+        </w:rPr>
+        <w:t xml:space="preserve">as credenciais da rede local, habilitar o reporte por ethernet, </w:t>
+      </w:r>
+      <w:bookmarkStart w:id="288" w:name="_GoBack"/>
+      <w:bookmarkEnd w:id="288"/>
+      <w:r>
+        <w:rPr>
+          <w:rFonts w:hint="default"/>
+        </w:rPr>
+        <w:t>o IP e a porta de destino do SAGE, por meio do aplicativo móvel Programador JFL Mob, disponibilizado pela fabricante</w:t>
+      </w:r>
+      <w:r>
+        <w:rPr>
+          <w:rFonts w:hint="default"/>
+          <w:lang w:val="pt-BR"/>
+        </w:rPr>
+        <w:t xml:space="preserve"> na APP Store e Play Store</w:t>
+      </w:r>
+      <w:r>
+        <w:rPr>
+          <w:rFonts w:hint="default"/>
+        </w:rPr>
+        <w:t>.</w:t>
+      </w:r>
+    </w:p>
+    <w:p>
+      <w:pPr>
+        <w:rPr>
+          <w:rFonts w:hint="default"/>
+        </w:rPr>
+      </w:pPr>
+      <w:r>
+        <w:rPr>
+          <w:rFonts w:hint="default"/>
+        </w:rPr>
+        <w:t>Cada unidade habitacional terá um controle remoto que, ao ser acionado, enviará um sinal de radiofrequência de 868 MHz para a central de alarmes. Nesse instante, o controle remoto piscará o LED indicador. Caso o sinal seja recebido com sucesso pela central, o LED piscará na cor verde; caso contrário, piscará na cor vermelha. A central será posicionada de forma estratégica, no centro da instituição, garantindo o alcance a todas as unidades habitacionais.</w:t>
+      </w:r>
+    </w:p>
+    <w:p>
+      <w:pPr>
+        <w:rPr>
+          <w:rFonts w:hint="default"/>
+          <w:lang w:val="pt-BR"/>
+        </w:rPr>
+      </w:pPr>
+      <w:r>
+        <w:rPr>
+          <w:rFonts w:hint="default"/>
+          <w:lang w:val="pt-BR"/>
+        </w:rPr>
         <w:drawing>
           <wp:inline distT="0" distB="0" distL="114300" distR="114300">
-            <wp:extent cx="5753735" cy="2170430"/>
-            <wp:effectExtent l="9525" t="9525" r="12700" b="14605"/>
-            <wp:docPr id="4" name="Imagem 1"/>
+            <wp:extent cx="3062605" cy="1450975"/>
+            <wp:effectExtent l="9525" t="9525" r="21590" b="17780"/>
+            <wp:docPr id="4" name="Imagem 4" descr="logo-app"/>
             <wp:cNvGraphicFramePr>
               <a:graphicFrameLocks xmlns:a="http://schemas.openxmlformats.org/drawingml/2006/main" noChangeAspect="1"/>
             </wp:cNvGraphicFramePr>
@@ -10009,7 +10164,7 @@
               <a:graphicData uri="http://schemas.openxmlformats.org/drawingml/2006/picture">
                 <pic:pic xmlns:pic="http://schemas.openxmlformats.org/drawingml/2006/picture">
                   <pic:nvPicPr>
-                    <pic:cNvPr id="4" name="Imagem 1"/>
+                    <pic:cNvPr id="4" name="Imagem 4" descr="logo-app"/>
                     <pic:cNvPicPr>
                       <a:picLocks noChangeAspect="1"/>
                     </pic:cNvPicPr>
@@ -10023,13 +10178,12 @@
                   <pic:spPr>
                     <a:xfrm>
                       <a:off x="0" y="0"/>
-                      <a:ext cx="5753735" cy="2170430"/>
+                      <a:ext cx="3062605" cy="1450975"/>
                     </a:xfrm>
                     <a:prstGeom prst="rect">
                       <a:avLst/>
                     </a:prstGeom>
-                    <a:noFill/>
-                    <a:ln w="3175">
+                    <a:ln>
                       <a:solidFill>
                         <a:schemeClr val="tx1"/>
                       </a:solidFill>
@@ -10045,9 +10199,254 @@
     <w:p>
       <w:pPr>
         <w:pStyle w:val="24"/>
-      </w:pPr>
-      <w:bookmarkStart w:id="18" w:name="_Toc208903634"/>
-      <w:r>
+        <w:rPr>
+          <w:rFonts w:hint="default"/>
+          <w:lang w:val="pt-BR"/>
+        </w:rPr>
+      </w:pPr>
+      <w:r>
+        <w:rPr>
+          <w:rFonts w:hint="default"/>
+          <w:lang w:val="pt-BR"/>
+        </w:rPr>
+        <w:t>FIGURA</w:t>
+      </w:r>
+      <w:r>
+        <w:t xml:space="preserve"> </w:t>
+      </w:r>
+      <w:r>
+        <w:fldChar w:fldCharType="begin"/>
+      </w:r>
+      <w:r>
+        <w:instrText xml:space="preserve"> SEQ Figura \* ARABIC </w:instrText>
+      </w:r>
+      <w:r>
+        <w:fldChar w:fldCharType="separate"/>
+      </w:r>
+      <w:r>
+        <w:t>2</w:t>
+      </w:r>
+      <w:r>
+        <w:fldChar w:fldCharType="end"/>
+      </w:r>
+      <w:bookmarkStart w:id="18" w:name="_Toc27425"/>
+      <w:r>
+        <w:rPr>
+          <w:rFonts w:hint="default"/>
+          <w:lang w:val="pt-BR"/>
+        </w:rPr>
+        <w:t xml:space="preserve"> - Programador JFL Mob</w:t>
+      </w:r>
+      <w:bookmarkEnd w:id="18"/>
+    </w:p>
+    <w:p>
+      <w:pPr>
+        <w:pStyle w:val="24"/>
+      </w:pPr>
+      <w:r>
+        <w:t xml:space="preserve">FONTE: </w:t>
+      </w:r>
+      <w:r>
+        <w:rPr>
+          <w:rFonts w:hint="default"/>
+          <w:lang w:val="pt-BR"/>
+        </w:rPr>
+        <w:t>APP Store</w:t>
+      </w:r>
+      <w:r>
+        <w:t xml:space="preserve"> (2025)</w:t>
+      </w:r>
+    </w:p>
+    <w:p>
+      <w:pPr>
+        <w:rPr>
+          <w:rFonts w:hint="default"/>
+        </w:rPr>
+      </w:pPr>
+    </w:p>
+    <w:p>
+      <w:pPr>
+        <w:rPr>
+          <w:rFonts w:hint="default"/>
+          <w:lang w:val="pt-BR"/>
+        </w:rPr>
+      </w:pPr>
+      <w:r>
+        <w:rPr>
+          <w:rFonts w:hint="default"/>
+          <w:lang w:val="pt-BR"/>
+        </w:rPr>
+        <w:drawing>
+          <wp:inline distT="0" distB="0" distL="114300" distR="114300">
+            <wp:extent cx="1950720" cy="4225925"/>
+            <wp:effectExtent l="9525" t="9525" r="20955" b="16510"/>
+            <wp:docPr id="5" name="Imagem 5" descr="programar-wifi"/>
+            <wp:cNvGraphicFramePr>
+              <a:graphicFrameLocks xmlns:a="http://schemas.openxmlformats.org/drawingml/2006/main" noChangeAspect="1"/>
+            </wp:cNvGraphicFramePr>
+            <a:graphic xmlns:a="http://schemas.openxmlformats.org/drawingml/2006/main">
+              <a:graphicData uri="http://schemas.openxmlformats.org/drawingml/2006/picture">
+                <pic:pic xmlns:pic="http://schemas.openxmlformats.org/drawingml/2006/picture">
+                  <pic:nvPicPr>
+                    <pic:cNvPr id="5" name="Imagem 5" descr="programar-wifi"/>
+                    <pic:cNvPicPr>
+                      <a:picLocks noChangeAspect="1"/>
+                    </pic:cNvPicPr>
+                  </pic:nvPicPr>
+                  <pic:blipFill>
+                    <a:blip r:embed="rId13"/>
+                    <a:stretch>
+                      <a:fillRect/>
+                    </a:stretch>
+                  </pic:blipFill>
+                  <pic:spPr>
+                    <a:xfrm>
+                      <a:off x="0" y="0"/>
+                      <a:ext cx="1950720" cy="4225925"/>
+                    </a:xfrm>
+                    <a:prstGeom prst="rect">
+                      <a:avLst/>
+                    </a:prstGeom>
+                    <a:ln>
+                      <a:solidFill>
+                        <a:schemeClr val="tx1"/>
+                      </a:solidFill>
+                    </a:ln>
+                  </pic:spPr>
+                </pic:pic>
+              </a:graphicData>
+            </a:graphic>
+          </wp:inline>
+        </w:drawing>
+      </w:r>
+    </w:p>
+    <w:p>
+      <w:pPr>
+        <w:pStyle w:val="24"/>
+        <w:rPr>
+          <w:rFonts w:hint="default"/>
+          <w:lang w:val="pt-BR"/>
+        </w:rPr>
+      </w:pPr>
+      <w:r>
+        <w:rPr>
+          <w:rFonts w:hint="default"/>
+          <w:lang w:val="pt-BR"/>
+        </w:rPr>
+        <w:t>FIGURA</w:t>
+      </w:r>
+      <w:r>
+        <w:t xml:space="preserve"> </w:t>
+      </w:r>
+      <w:r>
+        <w:fldChar w:fldCharType="begin"/>
+      </w:r>
+      <w:r>
+        <w:instrText xml:space="preserve"> SEQ Figura \* ARABIC </w:instrText>
+      </w:r>
+      <w:r>
+        <w:fldChar w:fldCharType="separate"/>
+      </w:r>
+      <w:r>
+        <w:t>3</w:t>
+      </w:r>
+      <w:r>
+        <w:fldChar w:fldCharType="end"/>
+      </w:r>
+      <w:bookmarkStart w:id="19" w:name="_Toc17565"/>
+      <w:r>
+        <w:rPr>
+          <w:rFonts w:hint="default"/>
+          <w:lang w:val="pt-BR"/>
+        </w:rPr>
+        <w:t xml:space="preserve"> - Configurando as credenciais da rede</w:t>
+      </w:r>
+      <w:bookmarkEnd w:id="19"/>
+    </w:p>
+    <w:p>
+      <w:pPr>
+        <w:pStyle w:val="24"/>
+      </w:pPr>
+      <w:r>
+        <w:t>FONTE: JFL Alarmes (2025)</w:t>
+      </w:r>
+    </w:p>
+    <w:p>
+      <w:pPr>
+        <w:rPr>
+          <w:rFonts w:hint="default"/>
+        </w:rPr>
+      </w:pPr>
+    </w:p>
+    <w:p>
+      <w:pPr>
+        <w:rPr>
+          <w:rFonts w:hint="default"/>
+          <w:lang w:val="pt-BR"/>
+        </w:rPr>
+      </w:pPr>
+      <w:r>
+        <w:rPr>
+          <w:rFonts w:hint="default"/>
+          <w:lang w:val="pt-BR"/>
+        </w:rPr>
+        <w:drawing>
+          <wp:inline distT="0" distB="0" distL="114300" distR="114300">
+            <wp:extent cx="1958340" cy="4241800"/>
+            <wp:effectExtent l="9525" t="9525" r="13335" b="15875"/>
+            <wp:docPr id="6" name="Imagem 6" descr="programar-reporte"/>
+            <wp:cNvGraphicFramePr>
+              <a:graphicFrameLocks xmlns:a="http://schemas.openxmlformats.org/drawingml/2006/main" noChangeAspect="1"/>
+            </wp:cNvGraphicFramePr>
+            <a:graphic xmlns:a="http://schemas.openxmlformats.org/drawingml/2006/main">
+              <a:graphicData uri="http://schemas.openxmlformats.org/drawingml/2006/picture">
+                <pic:pic xmlns:pic="http://schemas.openxmlformats.org/drawingml/2006/picture">
+                  <pic:nvPicPr>
+                    <pic:cNvPr id="6" name="Imagem 6" descr="programar-reporte"/>
+                    <pic:cNvPicPr>
+                      <a:picLocks noChangeAspect="1"/>
+                    </pic:cNvPicPr>
+                  </pic:nvPicPr>
+                  <pic:blipFill>
+                    <a:blip r:embed="rId14"/>
+                    <a:stretch>
+                      <a:fillRect/>
+                    </a:stretch>
+                  </pic:blipFill>
+                  <pic:spPr>
+                    <a:xfrm>
+                      <a:off x="0" y="0"/>
+                      <a:ext cx="1958340" cy="4241800"/>
+                    </a:xfrm>
+                    <a:prstGeom prst="rect">
+                      <a:avLst/>
+                    </a:prstGeom>
+                    <a:ln>
+                      <a:solidFill>
+                        <a:schemeClr val="tx1"/>
+                      </a:solidFill>
+                    </a:ln>
+                  </pic:spPr>
+                </pic:pic>
+              </a:graphicData>
+            </a:graphic>
+          </wp:inline>
+        </w:drawing>
+      </w:r>
+    </w:p>
+    <w:p>
+      <w:pPr>
+        <w:pStyle w:val="24"/>
+        <w:rPr>
+          <w:rFonts w:hint="default"/>
+          <w:lang w:val="pt-BR"/>
+        </w:rPr>
+      </w:pPr>
+      <w:r>
+        <w:rPr>
+          <w:rFonts w:hint="default"/>
+          <w:lang w:val="pt-BR"/>
+        </w:rPr>
         <w:t xml:space="preserve">FIGURA </w:t>
       </w:r>
       <w:r>
@@ -10060,29 +10459,152 @@
         <w:fldChar w:fldCharType="separate"/>
       </w:r>
       <w:r>
-        <w:t>2</w:t>
+        <w:t>4</w:t>
       </w:r>
       <w:r>
         <w:fldChar w:fldCharType="end"/>
       </w:r>
+      <w:bookmarkStart w:id="20" w:name="_Toc29843"/>
+      <w:r>
+        <w:rPr>
+          <w:rFonts w:hint="default"/>
+          <w:lang w:val="pt-BR"/>
+        </w:rPr>
+        <w:t xml:space="preserve"> - Configurando o </w:t>
+      </w:r>
+      <w:bookmarkEnd w:id="20"/>
+      <w:r>
+        <w:rPr>
+          <w:rFonts w:hint="default"/>
+          <w:lang w:val="pt-BR"/>
+        </w:rPr>
+        <w:t>reporte</w:t>
+      </w:r>
+    </w:p>
+    <w:p>
+      <w:pPr>
+        <w:pStyle w:val="24"/>
+      </w:pPr>
+      <w:r>
+        <w:t>FONTE: JFL Alarmes (2025)</w:t>
+      </w:r>
+    </w:p>
+    <w:p>
+      <w:pPr>
+        <w:rPr>
+          <w:rFonts w:hint="default"/>
+        </w:rPr>
+      </w:pPr>
+    </w:p>
+    <w:p>
+      <w:pPr>
+        <w:rPr>
+          <w:rFonts w:hint="default"/>
+        </w:rPr>
+      </w:pPr>
+      <w:r>
+        <w:rPr>
+          <w:rFonts w:hint="default"/>
+        </w:rPr>
+        <w:t>Ao estabelecer conexão com a rede, a central enviará para a aplicação, via socket</w:t>
+      </w:r>
+      <w:r>
+        <w:rPr>
+          <w:rFonts w:hint="default"/>
+          <w:lang w:val="pt-BR"/>
+        </w:rPr>
+        <w:t xml:space="preserve"> TCP/IP</w:t>
+      </w:r>
+      <w:r>
+        <w:rPr>
+          <w:rFonts w:hint="default"/>
+        </w:rPr>
+        <w:t>, uma solicitação de conexão. A aplicação, por sua vez, responderá a esse comando, estabelecendo o elo entre a central e o sistema. Após essa etapa, os sinais de radiofrequência poderão ser transmitidos para a aplicação, informando o usuário acionador, conforme o protocolo fornecido pela JFL Alarmes. A Figura 2 ilustra a integração dos componentes.</w:t>
+      </w:r>
+    </w:p>
+    <w:p>
+      <w:pPr>
+        <w:rPr>
+          <w:rFonts w:hint="default"/>
+        </w:rPr>
+      </w:pPr>
+    </w:p>
+    <w:p>
+      <w:r>
+        <w:drawing>
+          <wp:inline distT="0" distB="0" distL="114300" distR="114300">
+            <wp:extent cx="5756910" cy="2233930"/>
+            <wp:effectExtent l="9525" t="9525" r="9525" b="12065"/>
+            <wp:docPr id="1" name="Imagem 1"/>
+            <wp:cNvGraphicFramePr>
+              <a:graphicFrameLocks xmlns:a="http://schemas.openxmlformats.org/drawingml/2006/main" noChangeAspect="1"/>
+            </wp:cNvGraphicFramePr>
+            <a:graphic xmlns:a="http://schemas.openxmlformats.org/drawingml/2006/main">
+              <a:graphicData uri="http://schemas.openxmlformats.org/drawingml/2006/picture">
+                <pic:pic xmlns:pic="http://schemas.openxmlformats.org/drawingml/2006/picture">
+                  <pic:nvPicPr>
+                    <pic:cNvPr id="1" name="Imagem 1"/>
+                    <pic:cNvPicPr>
+                      <a:picLocks noChangeAspect="1"/>
+                    </pic:cNvPicPr>
+                  </pic:nvPicPr>
+                  <pic:blipFill>
+                    <a:blip r:embed="rId15"/>
+                    <a:stretch>
+                      <a:fillRect/>
+                    </a:stretch>
+                  </pic:blipFill>
+                  <pic:spPr>
+                    <a:xfrm>
+                      <a:off x="0" y="0"/>
+                      <a:ext cx="5756910" cy="2233930"/>
+                    </a:xfrm>
+                    <a:prstGeom prst="rect">
+                      <a:avLst/>
+                    </a:prstGeom>
+                    <a:noFill/>
+                    <a:ln>
+                      <a:solidFill>
+                        <a:schemeClr val="tx1"/>
+                      </a:solidFill>
+                    </a:ln>
+                  </pic:spPr>
+                </pic:pic>
+              </a:graphicData>
+            </a:graphic>
+          </wp:inline>
+        </w:drawing>
+      </w:r>
+    </w:p>
+    <w:p>
+      <w:pPr>
+        <w:pStyle w:val="24"/>
+      </w:pPr>
+      <w:r>
+        <w:t xml:space="preserve">FIGURA </w:t>
+      </w:r>
+      <w:r>
+        <w:fldChar w:fldCharType="begin"/>
+      </w:r>
+      <w:r>
+        <w:instrText xml:space="preserve"> SEQ Figura \* ARABIC </w:instrText>
+      </w:r>
+      <w:r>
+        <w:fldChar w:fldCharType="separate"/>
+      </w:r>
+      <w:r>
+        <w:t>5</w:t>
+      </w:r>
+      <w:r>
+        <w:fldChar w:fldCharType="end"/>
+      </w:r>
+      <w:bookmarkStart w:id="21" w:name="_Toc2051"/>
       <w:r>
         <w:t xml:space="preserve"> – Integração dos componentes dentro do Sage</w:t>
       </w:r>
-      <w:bookmarkEnd w:id="18"/>
-    </w:p>
-    <w:p>
-      <w:pPr>
-        <w:rPr>
-          <w:highlight w:val="yellow"/>
-        </w:rPr>
-      </w:pPr>
-      <w:r>
-        <w:rPr>
-          <w:highlight w:val="yellow"/>
-        </w:rPr>
-        <w:t>/* As setas entre o boneco e a central seria bidirecional ??*/</w:t>
-      </w:r>
-    </w:p>
+      <w:bookmarkEnd w:id="21"/>
+    </w:p>
+    <w:p/>
     <w:p>
       <w:r>
         <w:t>A Figura 2 representa uma arquitetura simples, que opera exclusivamente em ambiente local. Essa abordagem é mais direta, com menor complexidade de implementação e manutenção, e não gera custos financeiros, pois dispensa o uso de serviços em nuvem.</w:t>
@@ -10093,11 +10615,11 @@
       <w:pPr>
         <w:pStyle w:val="3"/>
       </w:pPr>
-      <w:bookmarkStart w:id="19" w:name="_Toc16707"/>
+      <w:bookmarkStart w:id="22" w:name="_Toc16707"/>
       <w:r>
         <w:t>3.4 NÍVEIS DE DECISÃO E GRUPOS FUNCIONAIS ATENDIDOS</w:t>
       </w:r>
-      <w:bookmarkEnd w:id="19"/>
+      <w:bookmarkEnd w:id="22"/>
     </w:p>
     <w:p>
       <w:r>
@@ -10154,20 +10676,20 @@
           <w:caps w:val="0"/>
         </w:rPr>
       </w:pPr>
-      <w:bookmarkStart w:id="20" w:name="_Toc172810409"/>
+      <w:bookmarkStart w:id="23" w:name="_Toc172810409"/>
     </w:p>
     <w:p>
       <w:pPr>
         <w:pStyle w:val="3"/>
       </w:pPr>
-      <w:bookmarkStart w:id="21" w:name="_Toc1968"/>
+      <w:bookmarkStart w:id="24" w:name="_Toc1968"/>
       <w:r>
         <w:rPr>
           <w:caps w:val="0"/>
         </w:rPr>
         <w:t>3.5 ADERÊNCIA AOS OBJETIVOS DE DESENVOLVIMENTO SUSTENTÁVEL (ODS)</w:t>
       </w:r>
-      <w:bookmarkEnd w:id="21"/>
+      <w:bookmarkEnd w:id="24"/>
     </w:p>
     <w:p>
       <w:r>
@@ -10231,19 +10753,19 @@
         </w:rPr>
       </w:pPr>
     </w:p>
-    <w:bookmarkEnd w:id="20"/>
+    <w:bookmarkEnd w:id="23"/>
     <w:p>
       <w:pPr>
         <w:pStyle w:val="3"/>
       </w:pPr>
-      <w:bookmarkStart w:id="22" w:name="_Toc12059"/>
+      <w:bookmarkStart w:id="25" w:name="_Toc12059"/>
       <w:r>
         <w:rPr>
           <w:caps w:val="0"/>
         </w:rPr>
         <w:t>3.6 MODELO DE NEGÓCIO</w:t>
       </w:r>
-      <w:bookmarkEnd w:id="22"/>
+      <w:bookmarkEnd w:id="25"/>
     </w:p>
     <w:p>
       <w:r>
@@ -10323,11 +10845,11 @@
       <w:pPr>
         <w:pStyle w:val="2"/>
       </w:pPr>
-      <w:bookmarkStart w:id="23" w:name="_Toc19639"/>
+      <w:bookmarkStart w:id="26" w:name="_Toc19639"/>
       <w:r>
         <w:t>4 MÉTODOS GERENCIAIS</w:t>
       </w:r>
-      <w:bookmarkEnd w:id="23"/>
+      <w:bookmarkEnd w:id="26"/>
     </w:p>
     <w:p>
       <w:r>
@@ -10339,11 +10861,11 @@
       <w:pPr>
         <w:pStyle w:val="3"/>
       </w:pPr>
-      <w:bookmarkStart w:id="24" w:name="_Toc27767"/>
+      <w:bookmarkStart w:id="27" w:name="_Toc27767"/>
       <w:r>
         <w:t>4.1 GERENCIAMENTO DO PROJETO</w:t>
       </w:r>
-      <w:bookmarkEnd w:id="24"/>
+      <w:bookmarkEnd w:id="27"/>
     </w:p>
     <w:p>
       <w:r>
@@ -10402,7 +10924,7 @@
                     </pic:cNvPicPr>
                   </pic:nvPicPr>
                   <pic:blipFill>
-                    <a:blip r:embed="rId13"/>
+                    <a:blip r:embed="rId16"/>
                     <a:stretch>
                       <a:fillRect/>
                     </a:stretch>
@@ -10433,7 +10955,6 @@
       <w:pPr>
         <w:pStyle w:val="24"/>
       </w:pPr>
-      <w:bookmarkStart w:id="25" w:name="_Toc208903635"/>
       <w:r>
         <w:t xml:space="preserve">FIGURA </w:t>
       </w:r>
@@ -10447,11 +10968,12 @@
         <w:fldChar w:fldCharType="separate"/>
       </w:r>
       <w:r>
-        <w:t>3</w:t>
+        <w:t>6</w:t>
       </w:r>
       <w:r>
         <w:fldChar w:fldCharType="end"/>
       </w:r>
+      <w:bookmarkStart w:id="28" w:name="_Toc25011"/>
       <w:r>
         <w:t xml:space="preserve"> - </w:t>
       </w:r>
@@ -10464,7 +10986,7 @@
       <w:r>
         <w:t>do projeto cadastrado no Jira</w:t>
       </w:r>
-      <w:bookmarkEnd w:id="25"/>
+      <w:bookmarkEnd w:id="28"/>
     </w:p>
     <w:p>
       <w:r>
@@ -10491,11 +11013,11 @@
       <w:pPr>
         <w:pStyle w:val="3"/>
       </w:pPr>
-      <w:bookmarkStart w:id="26" w:name="_Toc18161"/>
+      <w:bookmarkStart w:id="29" w:name="_Toc18161"/>
       <w:r>
         <w:t>4.2 MODELO DE CICLO DE VIDA</w:t>
       </w:r>
-      <w:bookmarkEnd w:id="26"/>
+      <w:bookmarkEnd w:id="29"/>
       <w:r>
         <w:t xml:space="preserve"> </w:t>
       </w:r>
@@ -10594,11 +11116,11 @@
       <w:pPr>
         <w:pStyle w:val="3"/>
       </w:pPr>
-      <w:bookmarkStart w:id="27" w:name="_Toc24582"/>
+      <w:bookmarkStart w:id="30" w:name="_Toc24582"/>
       <w:r>
         <w:t>4.3 RECURSOS NECESSÁRIOS</w:t>
       </w:r>
-      <w:bookmarkEnd w:id="27"/>
+      <w:bookmarkEnd w:id="30"/>
     </w:p>
     <w:p>
       <w:r>
@@ -10630,11 +11152,11 @@
       <w:pPr>
         <w:pStyle w:val="4"/>
       </w:pPr>
-      <w:bookmarkStart w:id="28" w:name="_Toc23085"/>
+      <w:bookmarkStart w:id="31" w:name="_Toc23085"/>
       <w:r>
         <w:t>4.3.1 Recursos Tecnológicos</w:t>
       </w:r>
-      <w:bookmarkEnd w:id="28"/>
+      <w:bookmarkEnd w:id="31"/>
     </w:p>
     <w:p>
       <w:pPr>
@@ -10776,11 +11298,11 @@
       <w:pPr>
         <w:pStyle w:val="4"/>
       </w:pPr>
-      <w:bookmarkStart w:id="29" w:name="_Toc7858"/>
+      <w:bookmarkStart w:id="32" w:name="_Toc7858"/>
       <w:r>
         <w:t>4.3.2 Recursos Humanos</w:t>
       </w:r>
-      <w:bookmarkEnd w:id="29"/>
+      <w:bookmarkEnd w:id="32"/>
     </w:p>
     <w:p>
       <w:r>
@@ -10822,11 +11344,11 @@
       <w:pPr>
         <w:pStyle w:val="3"/>
       </w:pPr>
-      <w:bookmarkStart w:id="30" w:name="_Toc28323"/>
+      <w:bookmarkStart w:id="33" w:name="_Toc28323"/>
       <w:r>
         <w:t>4.4 RELATÓRIO DE DESEMPENHO</w:t>
       </w:r>
-      <w:bookmarkEnd w:id="30"/>
+      <w:bookmarkEnd w:id="33"/>
       <w:r>
         <w:t xml:space="preserve"> </w:t>
       </w:r>
@@ -11047,11 +11569,11 @@
       <w:pPr>
         <w:pStyle w:val="3"/>
       </w:pPr>
-      <w:bookmarkStart w:id="31" w:name="_Toc17153"/>
+      <w:bookmarkStart w:id="34" w:name="_Toc17153"/>
       <w:r>
         <w:t>4.5 GERENCIAMENTO DE CONFIGURAÇÃO</w:t>
       </w:r>
-      <w:bookmarkEnd w:id="31"/>
+      <w:bookmarkEnd w:id="34"/>
     </w:p>
     <w:p>
       <w:r>
@@ -11063,11 +11585,11 @@
       <w:pPr>
         <w:pStyle w:val="4"/>
       </w:pPr>
-      <w:bookmarkStart w:id="32" w:name="_Toc25412"/>
+      <w:bookmarkStart w:id="35" w:name="_Toc25412"/>
       <w:r>
         <w:t>4.5.1 Papéis e Responsabilidades</w:t>
       </w:r>
-      <w:bookmarkEnd w:id="32"/>
+      <w:bookmarkEnd w:id="35"/>
     </w:p>
     <w:p>
       <w:r>
@@ -11116,11 +11638,11 @@
       <w:pPr>
         <w:pStyle w:val="4"/>
       </w:pPr>
-      <w:bookmarkStart w:id="33" w:name="_Toc11417"/>
+      <w:bookmarkStart w:id="36" w:name="_Toc11417"/>
       <w:r>
         <w:t>4.5.2 Identificação e Versionamento de Artefatos</w:t>
       </w:r>
-      <w:bookmarkEnd w:id="33"/>
+      <w:bookmarkEnd w:id="36"/>
     </w:p>
     <w:p>
       <w:r>
@@ -11132,11 +11654,11 @@
       <w:pPr>
         <w:pStyle w:val="4"/>
       </w:pPr>
-      <w:bookmarkStart w:id="34" w:name="_Toc2987"/>
+      <w:bookmarkStart w:id="37" w:name="_Toc2987"/>
       <w:r>
         <w:t>4.5.3 Organização dos Repositórios</w:t>
       </w:r>
-      <w:bookmarkEnd w:id="34"/>
+      <w:bookmarkEnd w:id="37"/>
     </w:p>
     <w:p>
       <w:r>
@@ -11166,11 +11688,11 @@
       <w:pPr>
         <w:pStyle w:val="4"/>
       </w:pPr>
-      <w:bookmarkStart w:id="35" w:name="_Toc20724"/>
+      <w:bookmarkStart w:id="38" w:name="_Toc20724"/>
       <w:r>
         <w:t>4.5.4 Controle de Versões</w:t>
       </w:r>
-      <w:bookmarkEnd w:id="35"/>
+      <w:bookmarkEnd w:id="38"/>
     </w:p>
     <w:p>
       <w:r>
@@ -11203,8 +11725,8 @@
       <w:r>
         <w:t>) após validação e testes.</w:t>
       </w:r>
-      <w:bookmarkStart w:id="36" w:name="_Toc192060090"/>
-      <w:bookmarkStart w:id="37" w:name="_Toc192060091"/>
+      <w:bookmarkStart w:id="39" w:name="_Toc192060090"/>
+      <w:bookmarkStart w:id="40" w:name="_Toc192060091"/>
       <w:r>
         <w:t xml:space="preserve"> A Figura 4 ilustra uma parte do repositório hospedado no Github (servidor em Nuvem).</w:t>
       </w:r>
@@ -11229,7 +11751,7 @@
                     </pic:cNvPicPr>
                   </pic:nvPicPr>
                   <pic:blipFill>
-                    <a:blip r:embed="rId14"/>
+                    <a:blip r:embed="rId17"/>
                     <a:stretch>
                       <a:fillRect/>
                     </a:stretch>
@@ -11258,7 +11780,6 @@
       <w:pPr>
         <w:pStyle w:val="24"/>
       </w:pPr>
-      <w:bookmarkStart w:id="38" w:name="_Toc208903636"/>
       <w:r>
         <w:t xml:space="preserve">FIGURA </w:t>
       </w:r>
@@ -11272,15 +11793,16 @@
         <w:fldChar w:fldCharType="separate"/>
       </w:r>
       <w:r>
-        <w:t>4</w:t>
+        <w:t>7</w:t>
       </w:r>
       <w:r>
         <w:fldChar w:fldCharType="end"/>
       </w:r>
+      <w:bookmarkStart w:id="41" w:name="_Toc30161"/>
       <w:r>
         <w:t xml:space="preserve"> - Repositório no Github</w:t>
       </w:r>
-      <w:bookmarkEnd w:id="38"/>
+      <w:bookmarkEnd w:id="41"/>
     </w:p>
     <w:p>
       <w:pPr>
@@ -11304,13 +11826,13 @@
       <w:pPr>
         <w:pStyle w:val="2"/>
       </w:pPr>
-      <w:bookmarkStart w:id="39" w:name="_Toc24211"/>
+      <w:bookmarkStart w:id="42" w:name="_Toc24211"/>
       <w:r>
         <w:t>5 ESPECIFICAÇÃO E ANÁLISE DOS REQUISITOS</w:t>
       </w:r>
-      <w:bookmarkEnd w:id="36"/>
-      <w:bookmarkEnd w:id="37"/>
       <w:bookmarkEnd w:id="39"/>
+      <w:bookmarkEnd w:id="40"/>
+      <w:bookmarkEnd w:id="42"/>
     </w:p>
     <w:p>
       <w:r>
@@ -11342,19 +11864,19 @@
       <w:pPr>
         <w:pStyle w:val="3"/>
       </w:pPr>
-      <w:bookmarkStart w:id="40" w:name="_Toc192060093"/>
-      <w:bookmarkStart w:id="41" w:name="_Toc20086"/>
+      <w:bookmarkStart w:id="43" w:name="_Toc192060093"/>
+      <w:bookmarkStart w:id="44" w:name="_Toc20086"/>
       <w:r>
         <w:t>5.1 REQUISITOS</w:t>
       </w:r>
-      <w:bookmarkEnd w:id="40"/>
+      <w:bookmarkEnd w:id="43"/>
       <w:r>
         <w:t xml:space="preserve"> DO SISTEMA DE SOFTWARE</w:t>
       </w:r>
-      <w:bookmarkEnd w:id="41"/>
-    </w:p>
-    <w:p>
-      <w:bookmarkStart w:id="42" w:name="_Toc192060094"/>
+      <w:bookmarkEnd w:id="44"/>
+    </w:p>
+    <w:p>
+      <w:bookmarkStart w:id="45" w:name="_Toc192060094"/>
       <w:r>
         <w:t>Esta seção apresenta os requisitos necessários para o desenvolvimento do software, classificados conforme sua prioridade em essencial, importante e desejável.</w:t>
       </w:r>
@@ -11379,13 +11901,13 @@
       <w:pPr>
         <w:pStyle w:val="4"/>
       </w:pPr>
-      <w:bookmarkStart w:id="43" w:name="_Toc24828"/>
+      <w:bookmarkStart w:id="46" w:name="_Toc24828"/>
       <w:r>
         <w:t>5.1.1 Requisitos Funcionais</w:t>
       </w:r>
-      <w:bookmarkEnd w:id="42"/>
-      <w:bookmarkEnd w:id="43"/>
-      <w:bookmarkStart w:id="44" w:name="_Toc192060095"/>
+      <w:bookmarkEnd w:id="45"/>
+      <w:bookmarkEnd w:id="46"/>
+      <w:bookmarkStart w:id="47" w:name="_Toc192060095"/>
     </w:p>
     <w:p>
       <w:pPr>
@@ -12612,18 +13134,18 @@
       <w:pPr>
         <w:pStyle w:val="4"/>
       </w:pPr>
-      <w:bookmarkStart w:id="45" w:name="_Toc15757"/>
+      <w:bookmarkStart w:id="48" w:name="_Toc15757"/>
       <w:r>
         <w:t>5.1.2 Requisitos Não Funcionais</w:t>
       </w:r>
-      <w:bookmarkEnd w:id="44"/>
-      <w:bookmarkEnd w:id="45"/>
+      <w:bookmarkEnd w:id="47"/>
+      <w:bookmarkEnd w:id="48"/>
     </w:p>
     <w:p>
       <w:r>
         <w:t>Os requisitos não funcionais definem as propriedades do sistema, bem como suas restrições. A classificação adotada está baseada em Sommerville (2018).</w:t>
       </w:r>
-      <w:bookmarkStart w:id="46" w:name="_Toc192060096"/>
+      <w:bookmarkStart w:id="49" w:name="_Toc192060096"/>
     </w:p>
     <w:p/>
     <w:p>
@@ -12634,7 +13156,7 @@
           <w:szCs w:val="24"/>
         </w:rPr>
       </w:pPr>
-      <w:bookmarkStart w:id="47" w:name="_Toc31583"/>
+      <w:bookmarkStart w:id="50" w:name="_Toc31583"/>
       <w:r>
         <w:rPr>
           <w:sz w:val="24"/>
@@ -12642,7 +13164,7 @@
         </w:rPr>
         <w:t>5.1.2.1 Requisitos de Produto</w:t>
       </w:r>
-      <w:bookmarkEnd w:id="47"/>
+      <w:bookmarkEnd w:id="50"/>
     </w:p>
     <w:p>
       <w:r>
@@ -13049,7 +13571,7 @@
           <w:szCs w:val="24"/>
         </w:rPr>
       </w:pPr>
-      <w:bookmarkStart w:id="48" w:name="_Toc22408"/>
+      <w:bookmarkStart w:id="51" w:name="_Toc22408"/>
       <w:r>
         <w:rPr>
           <w:sz w:val="24"/>
@@ -13057,7 +13579,7 @@
         </w:rPr>
         <w:t>5.1.2.2 Requisitos Organizacionais</w:t>
       </w:r>
-      <w:bookmarkEnd w:id="48"/>
+      <w:bookmarkEnd w:id="51"/>
     </w:p>
     <w:p>
       <w:r>
@@ -13471,11 +13993,11 @@
       <w:pPr>
         <w:pStyle w:val="4"/>
       </w:pPr>
-      <w:bookmarkStart w:id="49" w:name="_Toc4516"/>
+      <w:bookmarkStart w:id="52" w:name="_Toc4516"/>
       <w:r>
         <w:t>5.1.3 Principais Regras de Negócio</w:t>
       </w:r>
-      <w:bookmarkEnd w:id="49"/>
+      <w:bookmarkEnd w:id="52"/>
     </w:p>
     <w:p>
       <w:r>
@@ -13512,30 +14034,30 @@
       <w:pPr>
         <w:pStyle w:val="3"/>
       </w:pPr>
-      <w:bookmarkStart w:id="50" w:name="_Toc2358"/>
+      <w:bookmarkStart w:id="53" w:name="_Toc2358"/>
       <w:r>
         <w:t>5.2 ANÁLISE DOS REQUISITOS</w:t>
       </w:r>
-      <w:bookmarkEnd w:id="50"/>
+      <w:bookmarkEnd w:id="53"/>
     </w:p>
     <w:p>
       <w:pPr>
         <w:pStyle w:val="4"/>
       </w:pPr>
-      <w:bookmarkStart w:id="51" w:name="_Toc15294"/>
+      <w:bookmarkStart w:id="54" w:name="_Toc15294"/>
       <w:r>
         <w:t>5.2.1 Visão Funcional</w:t>
       </w:r>
-      <w:bookmarkEnd w:id="51"/>
-    </w:p>
-    <w:bookmarkEnd w:id="46"/>
-    <w:p>
-      <w:bookmarkStart w:id="52" w:name="_Toc192060097"/>
+      <w:bookmarkEnd w:id="54"/>
+    </w:p>
+    <w:bookmarkEnd w:id="49"/>
+    <w:p>
+      <w:bookmarkStart w:id="55" w:name="_Toc192060097"/>
       <w:r>
         <w:t xml:space="preserve">A visão funcional do sistema é representada por meio do modelo de casos de uso, que permite identificar e organizar as principais funcionalidades do sistema sob a perspectiva dos usuários. Esse modelo é composto por um diagrama de casos de uso, que ilustra graficamente os atores e suas interações com o sistema, e pelas descrições dos fluxos de eventos, que detalham o comportamento esperado em cada cenário. Essa abordagem contribui para uma compreensão clara dos requisitos funcionais e serve como base para as etapas posteriores do </w:t>
       </w:r>
-      <w:bookmarkEnd w:id="52"/>
-      <w:bookmarkStart w:id="53" w:name="_Toc192060098"/>
+      <w:bookmarkEnd w:id="55"/>
+      <w:bookmarkStart w:id="56" w:name="_Toc192060098"/>
       <w:r>
         <w:t>projeto.</w:t>
       </w:r>
@@ -13549,14 +14071,14 @@
       <w:pPr>
         <w:pStyle w:val="4"/>
       </w:pPr>
-      <w:bookmarkStart w:id="54" w:name="_Toc30622"/>
+      <w:bookmarkStart w:id="57" w:name="_Toc30622"/>
       <w:r>
         <w:rPr>
           <w:highlight w:val="yellow"/>
         </w:rPr>
         <w:t>Módulo de Comunicação central: o ator Central de Alarmes deve se relacionar com “Enviar mensagem” e não “Abrir conexão”.</w:t>
       </w:r>
-      <w:bookmarkEnd w:id="54"/>
+      <w:bookmarkEnd w:id="57"/>
     </w:p>
     <w:p>
       <w:r>
@@ -13610,20 +14132,20 @@
       <w:pPr>
         <w:pStyle w:val="4"/>
       </w:pPr>
-      <w:bookmarkStart w:id="55" w:name="_Toc11276"/>
+      <w:bookmarkStart w:id="58" w:name="_Toc11276"/>
       <w:r>
         <w:t>5.2.2 Modelo Conceitual dos Dados</w:t>
       </w:r>
-      <w:bookmarkEnd w:id="55"/>
-    </w:p>
-    <w:bookmarkEnd w:id="53"/>
-    <w:p>
-      <w:bookmarkStart w:id="56" w:name="_Toc192060100"/>
-      <w:bookmarkStart w:id="57" w:name="_Toc192060099"/>
+      <w:bookmarkEnd w:id="58"/>
+    </w:p>
+    <w:bookmarkEnd w:id="56"/>
+    <w:p>
+      <w:bookmarkStart w:id="59" w:name="_Toc192060100"/>
+      <w:bookmarkStart w:id="60" w:name="_Toc192060099"/>
       <w:r>
         <w:t>Esta seção apresenta o modelo de dados de um sistema com alto nível de abstração no qual as relações são construídas através da associação de um ou mais atributos das entidades. Trata-se do Modelo Conceitual representado por meio do Diagrama de Entidade-Relacionamento disponível no Apêndice D.</w:t>
       </w:r>
-      <w:bookmarkEnd w:id="56"/>
+      <w:bookmarkEnd w:id="59"/>
     </w:p>
     <w:p>
       <w:r>
@@ -13639,17 +14161,17 @@
         <w:t>;  “Rua” para “Logradouro”*/</w:t>
       </w:r>
     </w:p>
-    <w:bookmarkEnd w:id="57"/>
+    <w:bookmarkEnd w:id="60"/>
     <w:p>
       <w:pPr>
         <w:pStyle w:val="4"/>
       </w:pPr>
-      <w:bookmarkStart w:id="58" w:name="_Toc28485"/>
-      <w:bookmarkStart w:id="59" w:name="_Toc192060101"/>
+      <w:bookmarkStart w:id="61" w:name="_Toc28485"/>
+      <w:bookmarkStart w:id="62" w:name="_Toc192060101"/>
       <w:r>
         <w:t>5.2.3 Modelo Inicial da Interface de Usuário</w:t>
       </w:r>
-      <w:bookmarkEnd w:id="58"/>
+      <w:bookmarkEnd w:id="61"/>
     </w:p>
     <w:p>
       <w:r>
@@ -13695,18 +14217,18 @@
       <w:pPr>
         <w:pStyle w:val="2"/>
       </w:pPr>
-      <w:bookmarkStart w:id="60" w:name="_Toc31227"/>
+      <w:bookmarkStart w:id="63" w:name="_Toc31227"/>
       <w:r>
         <w:t>6 ARQUITETURA E PROJETO</w:t>
       </w:r>
-      <w:bookmarkEnd w:id="59"/>
+      <w:bookmarkEnd w:id="62"/>
       <w:r>
         <w:t xml:space="preserve"> DO SISTEMA DE SOFTWARE</w:t>
       </w:r>
-      <w:bookmarkEnd w:id="60"/>
-    </w:p>
-    <w:p>
-      <w:bookmarkStart w:id="61" w:name="_Toc192060103"/>
+      <w:bookmarkEnd w:id="63"/>
+    </w:p>
+    <w:p>
+      <w:bookmarkStart w:id="64" w:name="_Toc192060103"/>
       <w:r>
         <w:t>Neste capítulo são apresentados os modelos arquiteturais e de projeto adotadas durante a construção do sistema. A arquitetura de software representa a organização estrutural do sistema, incluindo seus componentes principais, responsabilidades e a forma de como se comunicam. Já o projeto detalha como essas estruturas são implementadas, considerando aspectos como persistência de dados, controle de acesso, usabilidade e segurança. Assim, demonstram-se como as necessidades funcionais e não funcionais foram traduzidas em uma solução técnica coerente, eficiente e alinhada às boas práticas da engenharia de software.</w:t>
       </w:r>
@@ -13813,18 +14335,18 @@
       <w:pPr>
         <w:pStyle w:val="3"/>
       </w:pPr>
-      <w:bookmarkStart w:id="62" w:name="_Toc15076"/>
+      <w:bookmarkStart w:id="65" w:name="_Toc15076"/>
       <w:r>
         <w:t>6.1 V</w:t>
       </w:r>
-      <w:bookmarkEnd w:id="61"/>
+      <w:bookmarkEnd w:id="64"/>
       <w:r>
         <w:t>ISÃO ESTRUTURAL</w:t>
       </w:r>
-      <w:bookmarkEnd w:id="62"/>
-    </w:p>
-    <w:p>
-      <w:bookmarkStart w:id="63" w:name="_Toc192060104"/>
+      <w:bookmarkEnd w:id="65"/>
+    </w:p>
+    <w:p>
+      <w:bookmarkStart w:id="66" w:name="_Toc192060104"/>
       <w:r>
         <w:t xml:space="preserve">A visão estrutural do sistema apresenta a forma como os principais componentes estão organizados e como se relacionam entre si.  Nessa estrutura deve-se buscar promover baixo acoplamento e alta coesão, facilitando a manutenção e a evolução do sistema ao longo do tempo. </w:t>
       </w:r>
@@ -13833,12 +14355,12 @@
       <w:pPr>
         <w:pStyle w:val="4"/>
       </w:pPr>
-      <w:bookmarkStart w:id="64" w:name="_Toc31355"/>
+      <w:bookmarkStart w:id="67" w:name="_Toc31355"/>
       <w:r>
         <w:t>6.1.1 Diagrama de Pacotes</w:t>
       </w:r>
-      <w:bookmarkEnd w:id="63"/>
-      <w:bookmarkEnd w:id="64"/>
+      <w:bookmarkEnd w:id="66"/>
+      <w:bookmarkEnd w:id="67"/>
     </w:p>
     <w:p>
       <w:r>
@@ -13855,7 +14377,7 @@
           <w:tab w:val="clear" w:pos="425"/>
         </w:tabs>
       </w:pPr>
-      <w:bookmarkStart w:id="65" w:name="_Toc192060105"/>
+      <w:bookmarkStart w:id="68" w:name="_Toc192060105"/>
       <w:r>
         <w:t>API</w:t>
       </w:r>
@@ -14559,15 +15081,15 @@
       <w:pPr>
         <w:pStyle w:val="4"/>
       </w:pPr>
-      <w:bookmarkStart w:id="66" w:name="_Toc1139"/>
+      <w:bookmarkStart w:id="69" w:name="_Toc1139"/>
       <w:r>
         <w:t>6.1.2 Diagramas de Classes</w:t>
       </w:r>
-      <w:bookmarkEnd w:id="65"/>
-      <w:bookmarkEnd w:id="66"/>
-    </w:p>
-    <w:p>
-      <w:bookmarkStart w:id="67" w:name="_Toc192060106"/>
+      <w:bookmarkEnd w:id="68"/>
+      <w:bookmarkEnd w:id="69"/>
+    </w:p>
+    <w:p>
+      <w:bookmarkStart w:id="70" w:name="_Toc192060106"/>
       <w:r>
         <w:t>O diagrama de classes representa a estrutura de dados do sistema e os relacionamentos entre as entidades principais. Cada classe encapsula atributos e métodos que representam o comportamento e as informações do sistema.</w:t>
       </w:r>
@@ -14864,12 +15386,12 @@
       <w:pPr>
         <w:pStyle w:val="3"/>
       </w:pPr>
-      <w:bookmarkStart w:id="68" w:name="_Toc23869"/>
+      <w:bookmarkStart w:id="71" w:name="_Toc23869"/>
       <w:r>
         <w:t>6.2 VISÃO COMPORTAMENTAL</w:t>
       </w:r>
-      <w:bookmarkEnd w:id="67"/>
-      <w:bookmarkEnd w:id="68"/>
+      <w:bookmarkEnd w:id="70"/>
+      <w:bookmarkEnd w:id="71"/>
     </w:p>
     <w:p>
       <w:r>
@@ -14895,11 +15417,11 @@
       <w:pPr>
         <w:pStyle w:val="4"/>
       </w:pPr>
-      <w:bookmarkStart w:id="69" w:name="_Toc15356"/>
+      <w:bookmarkStart w:id="72" w:name="_Toc15356"/>
       <w:r>
         <w:t>6.2.1 Projeto das Interações entre Objetos</w:t>
       </w:r>
-      <w:bookmarkEnd w:id="69"/>
+      <w:bookmarkEnd w:id="72"/>
     </w:p>
     <w:p>
       <w:pPr>
@@ -14909,7 +15431,7 @@
           <w:szCs w:val="24"/>
         </w:rPr>
       </w:pPr>
-      <w:bookmarkStart w:id="70" w:name="_Toc15581"/>
+      <w:bookmarkStart w:id="73" w:name="_Toc15581"/>
       <w:r>
         <w:rPr>
           <w:sz w:val="24"/>
@@ -14917,7 +15439,7 @@
         </w:rPr>
         <w:t>6.2.1.1 Diagramas de Sequência</w:t>
       </w:r>
-      <w:bookmarkEnd w:id="70"/>
+      <w:bookmarkEnd w:id="73"/>
     </w:p>
     <w:p>
       <w:r>
@@ -14929,11 +15451,11 @@
       <w:pPr>
         <w:pStyle w:val="3"/>
       </w:pPr>
-      <w:bookmarkStart w:id="71" w:name="_Toc6544"/>
+      <w:bookmarkStart w:id="74" w:name="_Toc6544"/>
       <w:r>
         <w:t>6.3 VISÃO DOS DADOS</w:t>
       </w:r>
-      <w:bookmarkEnd w:id="71"/>
+      <w:bookmarkEnd w:id="74"/>
     </w:p>
     <w:p>
       <w:r>
@@ -14959,11 +15481,11 @@
       <w:pPr>
         <w:pStyle w:val="4"/>
       </w:pPr>
-      <w:bookmarkStart w:id="72" w:name="_Toc356"/>
+      <w:bookmarkStart w:id="75" w:name="_Toc356"/>
       <w:r>
         <w:t>6.3.1 Modelo Lógico</w:t>
       </w:r>
-      <w:bookmarkEnd w:id="72"/>
+      <w:bookmarkEnd w:id="75"/>
     </w:p>
     <w:p>
       <w:r>
@@ -14992,11 +15514,11 @@
       <w:pPr>
         <w:pStyle w:val="4"/>
       </w:pPr>
-      <w:bookmarkStart w:id="73" w:name="_Toc15440"/>
+      <w:bookmarkStart w:id="76" w:name="_Toc15440"/>
       <w:r>
         <w:t>6.3.2 Dicionário de Dados do Modelo Lógico</w:t>
       </w:r>
-      <w:bookmarkEnd w:id="73"/>
+      <w:bookmarkEnd w:id="76"/>
     </w:p>
     <w:p>
       <w:r>
@@ -15016,11 +15538,11 @@
       <w:pPr>
         <w:pStyle w:val="3"/>
       </w:pPr>
-      <w:bookmarkStart w:id="74" w:name="_Toc12227"/>
+      <w:bookmarkStart w:id="77" w:name="_Toc12227"/>
       <w:r>
         <w:t>6.4 PROJETO DA INTERAÇÃO HUMANA-COMPUTADOR</w:t>
       </w:r>
-      <w:bookmarkEnd w:id="74"/>
+      <w:bookmarkEnd w:id="77"/>
     </w:p>
     <w:p>
       <w:r>
@@ -15191,14 +15713,14 @@
       <w:pPr>
         <w:pStyle w:val="4"/>
       </w:pPr>
-      <w:bookmarkStart w:id="75" w:name="_Toc13941"/>
+      <w:bookmarkStart w:id="78" w:name="_Toc13941"/>
       <w:r>
         <w:t>6.4.1 Perfil de Usuário</w:t>
       </w:r>
-      <w:bookmarkEnd w:id="75"/>
-    </w:p>
-    <w:p>
-      <w:bookmarkStart w:id="76" w:name="_Toc192060119"/>
+      <w:bookmarkEnd w:id="78"/>
+    </w:p>
+    <w:p>
+      <w:bookmarkStart w:id="79" w:name="_Toc192060119"/>
       <w:r>
         <w:t>Para a definição dos perfis de usuário do sistema, há três grupos principais com base nas funções e necessidades distintas em relação à aplicação: o usuário técnico, que utiliza o sistema para monitorar os pedidos de emergência; o(a) enfermeiro(a), responsável pela gestão e manutenção dos dados; e o residente, que realiza os pedidos de emergência. A fim de compreender melhor as expectativas, experiências prévias e possíveis dificuldades desses perfis em relação ao sistema proposto, foi elaborado um questionário online utilizando a ferramenta Google Forms. Esse formulário teve caráter exclusivamente acadêmico, sem a coleta de dados pessoais, anônimo e com respeito à privacidade dos participantes. As perguntas foram estruturadas para levantar dados relevantes sobre a familiaridade dos usuários com tecnologias similares, frequência de uso de sistemas digitais, nível de conforto ao utilizá-los e preferências quanto à usabilidade. Os participantes foram questionados sobre qual seria o seu perfil de uso no sistema, com que frequência utilizam sistemas digitais no dia a dia, e o quanto se sentem confortáveis com o uso dessas tecnologias, em uma escala de 1 (nada confortável) a 5 (muito confortável). Também foram abordadas questões sobre a importância de receber notificações em tempo real e sobre a preferência entre uma interface de usuário mais simples e direta, com menos funcionalidades visíveis, ou uma mais completa, ainda que com mais opções na tela. Por fim, foi solicitado que os usuários apontassem qual aspecto consideram mais crítico para a aceitação do sistema. A aplicação do formulário possibilitou a coleta de dados quantitativos e qualitativos que contribuíram diretamente para a definição de requisitos mais alinhados às necessidades reais dos usuários. A coleta de dados foi realizada no período de 22/05/2025 a 05/06/2025, contando com 6 respondentes, pertencentes ao público composto por técnico(a)s em enfermagem e uma enfermeira.</w:t>
       </w:r>
@@ -15213,13 +15735,13 @@
       <w:pPr>
         <w:pStyle w:val="4"/>
       </w:pPr>
-      <w:bookmarkStart w:id="77" w:name="_Toc204949523"/>
-      <w:bookmarkStart w:id="78" w:name="_Toc22068"/>
+      <w:bookmarkStart w:id="80" w:name="_Toc22068"/>
+      <w:bookmarkStart w:id="81" w:name="_Toc204949523"/>
       <w:r>
         <w:t>6.4.2 Projeto da Interface de Usuário</w:t>
       </w:r>
-      <w:bookmarkEnd w:id="77"/>
-      <w:bookmarkEnd w:id="78"/>
+      <w:bookmarkEnd w:id="80"/>
+      <w:bookmarkEnd w:id="81"/>
     </w:p>
     <w:p>
       <w:r>
@@ -15244,17 +15766,17 @@
       <w:pPr>
         <w:pStyle w:val="4"/>
       </w:pPr>
-      <w:bookmarkStart w:id="79" w:name="_Toc204949524"/>
-      <w:bookmarkStart w:id="80" w:name="_Toc46909558"/>
-      <w:bookmarkStart w:id="81" w:name="_Toc172810440"/>
-      <w:bookmarkStart w:id="82" w:name="_Toc5799"/>
+      <w:bookmarkStart w:id="82" w:name="_Toc172810440"/>
+      <w:bookmarkStart w:id="83" w:name="_Toc204949524"/>
+      <w:bookmarkStart w:id="84" w:name="_Toc46909558"/>
+      <w:bookmarkStart w:id="85" w:name="_Toc5799"/>
       <w:r>
         <w:t>6.4.3 Heurísticas de Usabilidade</w:t>
       </w:r>
-      <w:bookmarkEnd w:id="79"/>
-      <w:bookmarkEnd w:id="80"/>
-      <w:bookmarkEnd w:id="81"/>
       <w:bookmarkEnd w:id="82"/>
+      <w:bookmarkEnd w:id="83"/>
+      <w:bookmarkEnd w:id="84"/>
+      <w:bookmarkEnd w:id="85"/>
       <w:r>
         <w:t xml:space="preserve"> </w:t>
       </w:r>
@@ -15548,15 +16070,15 @@
       <w:pPr>
         <w:pStyle w:val="4"/>
       </w:pPr>
-      <w:bookmarkStart w:id="83" w:name="_Toc172810441"/>
-      <w:bookmarkStart w:id="84" w:name="_Toc204949525"/>
-      <w:bookmarkStart w:id="85" w:name="_Toc1194"/>
+      <w:bookmarkStart w:id="86" w:name="_Toc172810441"/>
+      <w:bookmarkStart w:id="87" w:name="_Toc204949525"/>
+      <w:bookmarkStart w:id="88" w:name="_Toc1194"/>
       <w:r>
         <w:t>6.4.4 Projeto da Acessibilidade</w:t>
       </w:r>
-      <w:bookmarkEnd w:id="83"/>
-      <w:bookmarkEnd w:id="84"/>
-      <w:bookmarkEnd w:id="85"/>
+      <w:bookmarkEnd w:id="86"/>
+      <w:bookmarkEnd w:id="87"/>
+      <w:bookmarkEnd w:id="88"/>
       <w:r>
         <w:t xml:space="preserve"> </w:t>
       </w:r>
@@ -15694,21 +16216,21 @@
       <w:pPr>
         <w:pStyle w:val="3"/>
       </w:pPr>
-      <w:bookmarkStart w:id="86" w:name="_Toc14345922"/>
-      <w:bookmarkStart w:id="87" w:name="_Toc172810442"/>
-      <w:bookmarkStart w:id="88" w:name="_Toc46909559"/>
-      <w:bookmarkStart w:id="89" w:name="_Toc507747255"/>
-      <w:bookmarkStart w:id="90" w:name="_Toc204949526"/>
+      <w:bookmarkStart w:id="89" w:name="_Toc14345922"/>
+      <w:bookmarkStart w:id="90" w:name="_Toc46909559"/>
       <w:bookmarkStart w:id="91" w:name="_Toc16697"/>
+      <w:bookmarkStart w:id="92" w:name="_Toc204949526"/>
+      <w:bookmarkStart w:id="93" w:name="_Toc507747255"/>
+      <w:bookmarkStart w:id="94" w:name="_Toc172810442"/>
       <w:r>
         <w:t>6.5 PROJETO DO SISTEMA DISTRIBUÍDO</w:t>
       </w:r>
-      <w:bookmarkEnd w:id="86"/>
-      <w:bookmarkEnd w:id="87"/>
-      <w:bookmarkEnd w:id="88"/>
       <w:bookmarkEnd w:id="89"/>
       <w:bookmarkEnd w:id="90"/>
       <w:bookmarkEnd w:id="91"/>
+      <w:bookmarkEnd w:id="92"/>
+      <w:bookmarkEnd w:id="93"/>
+      <w:bookmarkEnd w:id="94"/>
     </w:p>
     <w:p>
       <w:r>
@@ -15732,10 +16254,10 @@
           <w:kern w:val="32"/>
         </w:rPr>
       </w:pPr>
-      <w:bookmarkStart w:id="92" w:name="_Toc172810445"/>
-      <w:bookmarkStart w:id="93" w:name="_Toc204949527"/>
-      <w:bookmarkStart w:id="94" w:name="_Toc46909562"/>
-      <w:bookmarkStart w:id="95" w:name="_Toc14345916"/>
+      <w:bookmarkStart w:id="95" w:name="_Toc46909562"/>
+      <w:bookmarkStart w:id="96" w:name="_Toc172810445"/>
+      <w:bookmarkStart w:id="97" w:name="_Toc204949527"/>
+      <w:bookmarkStart w:id="98" w:name="_Toc14345916"/>
       <w:r>
         <w:br w:type="page"/>
       </w:r>
@@ -15744,14 +16266,14 @@
       <w:pPr>
         <w:pStyle w:val="2"/>
       </w:pPr>
-      <w:bookmarkStart w:id="96" w:name="_Toc31157"/>
+      <w:bookmarkStart w:id="99" w:name="_Toc31157"/>
       <w:r>
         <w:t>7 IMPLEMENTAÇÃO DO SISTEMA DE SOFTWARE</w:t>
       </w:r>
-      <w:bookmarkEnd w:id="92"/>
-      <w:bookmarkEnd w:id="93"/>
-      <w:bookmarkEnd w:id="94"/>
+      <w:bookmarkEnd w:id="95"/>
       <w:bookmarkEnd w:id="96"/>
+      <w:bookmarkEnd w:id="97"/>
+      <w:bookmarkEnd w:id="99"/>
     </w:p>
     <w:p>
       <w:pPr>
@@ -15762,9 +16284,9 @@
         </w:rPr>
       </w:pPr>
     </w:p>
-    <w:bookmarkEnd w:id="95"/>
-    <w:p>
-      <w:bookmarkStart w:id="97" w:name="_Toc507747249"/>
+    <w:bookmarkEnd w:id="98"/>
+    <w:p>
+      <w:bookmarkStart w:id="100" w:name="_Toc507747249"/>
       <w:r>
         <w:t>A fase de implementação corresponde à tradução do projeto e de suas modelagens em códigos-fonte e executáveis, dando origem aos diversos componentes que compõem o sistema de software. Neste capítulo, são descritos os principais elementos desenvolvidos, as tecnologias utilizadas e a forma como cada componente está estruturado para garantir integração, desempenho e segurança.</w:t>
       </w:r>
@@ -15808,23 +16330,23 @@
         </w:rPr>
       </w:pPr>
     </w:p>
-    <w:bookmarkEnd w:id="97"/>
+    <w:bookmarkEnd w:id="100"/>
     <w:p>
       <w:pPr>
         <w:pStyle w:val="3"/>
       </w:pPr>
-      <w:bookmarkStart w:id="98" w:name="_Toc204949528"/>
-      <w:bookmarkStart w:id="99" w:name="_Toc172810446"/>
-      <w:bookmarkStart w:id="100" w:name="_Toc46909563"/>
-      <w:bookmarkStart w:id="101" w:name="_Toc16375"/>
-      <w:bookmarkStart w:id="102" w:name="_Toc14345918"/>
+      <w:bookmarkStart w:id="101" w:name="_Toc204949528"/>
+      <w:bookmarkStart w:id="102" w:name="_Toc172810446"/>
+      <w:bookmarkStart w:id="103" w:name="_Toc16375"/>
+      <w:bookmarkStart w:id="104" w:name="_Toc46909563"/>
+      <w:bookmarkStart w:id="105" w:name="_Toc14345918"/>
       <w:r>
         <w:t>7.1 COMPONENTES DO SISTEMA DE SOFTWARE</w:t>
       </w:r>
-      <w:bookmarkEnd w:id="98"/>
-      <w:bookmarkEnd w:id="99"/>
-      <w:bookmarkEnd w:id="100"/>
       <w:bookmarkEnd w:id="101"/>
+      <w:bookmarkEnd w:id="102"/>
+      <w:bookmarkEnd w:id="103"/>
+      <w:bookmarkEnd w:id="104"/>
     </w:p>
     <w:p>
       <w:r>
@@ -15997,11 +16519,7 @@
     </w:p>
     <w:p>
       <w:r>
-        <w:t>O armazena</w:t>
-      </w:r>
-      <w:bookmarkStart w:id="285" w:name="_GoBack"/>
-      <w:r>
-        <w:t xml:space="preserve">mento dos dados é realizado por meio do PostgreSQL, responsável por manter os registros de </w:t>
+        <w:t xml:space="preserve">O armazenamento dos dados é realizado por meio do PostgreSQL, responsável por manter os registros de </w:t>
       </w:r>
       <w:r>
         <w:rPr>
@@ -16010,11 +16528,7 @@
         <w:t>residente</w:t>
       </w:r>
       <w:r>
-        <w:t>s, usu</w:t>
-      </w:r>
-      <w:bookmarkEnd w:id="285"/>
-      <w:r>
-        <w:t>ários e históricos de atendimentos. O banco de dados garante integridade transacional e conformidade com a LGPD, assegurando segurança e rastreabilidade das informações.</w:t>
+        <w:t>s, usuários e históricos de atendimentos. O banco de dados garante integridade transacional e conformidade com a LGPD, assegurando segurança e rastreabilidade das informações.</w:t>
       </w:r>
     </w:p>
     <w:p>
@@ -16035,43 +16549,43 @@
           <w:color w:val="0000FF"/>
         </w:rPr>
       </w:pPr>
-      <w:bookmarkStart w:id="103" w:name="_Toc46909564"/>
-      <w:bookmarkStart w:id="104" w:name="_Toc204949529"/>
-      <w:bookmarkStart w:id="105" w:name="_Toc172810447"/>
-      <w:bookmarkStart w:id="106" w:name="_Toc12160"/>
+      <w:bookmarkStart w:id="106" w:name="_Toc204949529"/>
+      <w:bookmarkStart w:id="107" w:name="_Toc46909564"/>
+      <w:bookmarkStart w:id="108" w:name="_Toc12160"/>
+      <w:bookmarkStart w:id="109" w:name="_Toc172810447"/>
       <w:r>
         <w:t>7.2 TECNOLOGIAS DE IMPLEMENTAÇÃO</w:t>
       </w:r>
-      <w:bookmarkEnd w:id="103"/>
-      <w:bookmarkEnd w:id="104"/>
-      <w:bookmarkEnd w:id="105"/>
       <w:bookmarkEnd w:id="106"/>
-    </w:p>
-    <w:p>
-      <w:pPr>
-        <w:pStyle w:val="4"/>
-      </w:pPr>
-      <w:bookmarkStart w:id="107" w:name="_Toc204949530"/>
-      <w:bookmarkStart w:id="108" w:name="_Toc46909565"/>
-      <w:bookmarkStart w:id="109" w:name="_Toc172810448"/>
-      <w:bookmarkStart w:id="110" w:name="_Toc9640"/>
-      <w:r>
-        <w:t xml:space="preserve">7.2.1 Linguagens de Programação e </w:t>
-      </w:r>
-      <w:r>
-        <w:rPr>
-          <w:i/>
-        </w:rPr>
-        <w:t xml:space="preserve">Frameworks </w:t>
-      </w:r>
-      <w:r>
-        <w:t>Adotados</w:t>
-      </w:r>
-      <w:bookmarkEnd w:id="102"/>
       <w:bookmarkEnd w:id="107"/>
       <w:bookmarkEnd w:id="108"/>
       <w:bookmarkEnd w:id="109"/>
+    </w:p>
+    <w:p>
+      <w:pPr>
+        <w:pStyle w:val="4"/>
+      </w:pPr>
+      <w:bookmarkStart w:id="110" w:name="_Toc46909565"/>
+      <w:bookmarkStart w:id="111" w:name="_Toc172810448"/>
+      <w:bookmarkStart w:id="112" w:name="_Toc204949530"/>
+      <w:bookmarkStart w:id="113" w:name="_Toc9640"/>
+      <w:r>
+        <w:t xml:space="preserve">7.2.1 Linguagens de Programação e </w:t>
+      </w:r>
+      <w:r>
+        <w:rPr>
+          <w:i/>
+        </w:rPr>
+        <w:t xml:space="preserve">Frameworks </w:t>
+      </w:r>
+      <w:r>
+        <w:t>Adotados</w:t>
+      </w:r>
+      <w:bookmarkEnd w:id="105"/>
       <w:bookmarkEnd w:id="110"/>
+      <w:bookmarkEnd w:id="111"/>
+      <w:bookmarkEnd w:id="112"/>
+      <w:bookmarkEnd w:id="113"/>
     </w:p>
     <w:p>
       <w:r>
@@ -16250,12 +16764,12 @@
       <w:pPr>
         <w:pStyle w:val="4"/>
       </w:pPr>
-      <w:bookmarkStart w:id="111" w:name="_Toc507747252"/>
-      <w:bookmarkStart w:id="112" w:name="_Toc204949531"/>
-      <w:bookmarkStart w:id="113" w:name="_Toc14345919"/>
-      <w:bookmarkStart w:id="114" w:name="_Toc46909566"/>
-      <w:bookmarkStart w:id="115" w:name="_Toc172810449"/>
-      <w:bookmarkStart w:id="116" w:name="_Toc4569"/>
+      <w:bookmarkStart w:id="114" w:name="_Toc507747252"/>
+      <w:bookmarkStart w:id="115" w:name="_Toc204949531"/>
+      <w:bookmarkStart w:id="116" w:name="_Toc172810449"/>
+      <w:bookmarkStart w:id="117" w:name="_Toc4569"/>
+      <w:bookmarkStart w:id="118" w:name="_Toc46909566"/>
+      <w:bookmarkStart w:id="119" w:name="_Toc14345919"/>
       <w:r>
         <w:t xml:space="preserve">7.2.2 </w:t>
       </w:r>
@@ -16265,15 +16779,15 @@
         </w:rPr>
         <w:t>Design Patterns</w:t>
       </w:r>
-      <w:bookmarkEnd w:id="111"/>
+      <w:bookmarkEnd w:id="114"/>
       <w:r>
         <w:t xml:space="preserve"> Aplicados</w:t>
       </w:r>
-      <w:bookmarkEnd w:id="112"/>
-      <w:bookmarkEnd w:id="113"/>
-      <w:bookmarkEnd w:id="114"/>
       <w:bookmarkEnd w:id="115"/>
       <w:bookmarkEnd w:id="116"/>
+      <w:bookmarkEnd w:id="117"/>
+      <w:bookmarkEnd w:id="118"/>
+      <w:bookmarkEnd w:id="119"/>
     </w:p>
     <w:p>
       <w:r>
@@ -16512,26 +17026,26 @@
           <w:color w:val="0000FF"/>
         </w:rPr>
       </w:pPr>
-      <w:bookmarkStart w:id="117" w:name="_Toc507747253"/>
+      <w:bookmarkStart w:id="120" w:name="_Toc507747253"/>
     </w:p>
     <w:p>
       <w:pPr>
         <w:pStyle w:val="4"/>
       </w:pPr>
-      <w:bookmarkStart w:id="118" w:name="_Toc46909567"/>
-      <w:bookmarkStart w:id="119" w:name="_Toc14345920"/>
-      <w:bookmarkStart w:id="120" w:name="_Toc204949532"/>
-      <w:bookmarkStart w:id="121" w:name="_Toc172810450"/>
-      <w:bookmarkStart w:id="122" w:name="_Toc19066"/>
+      <w:bookmarkStart w:id="121" w:name="_Toc14345920"/>
+      <w:bookmarkStart w:id="122" w:name="_Toc46909567"/>
+      <w:bookmarkStart w:id="123" w:name="_Toc172810450"/>
+      <w:bookmarkStart w:id="124" w:name="_Toc204949532"/>
+      <w:bookmarkStart w:id="125" w:name="_Toc19066"/>
       <w:r>
         <w:t>7.2.3 Convenções e Guias para Codificação</w:t>
       </w:r>
-      <w:bookmarkEnd w:id="117"/>
-      <w:bookmarkEnd w:id="118"/>
-      <w:bookmarkEnd w:id="119"/>
       <w:bookmarkEnd w:id="120"/>
       <w:bookmarkEnd w:id="121"/>
       <w:bookmarkEnd w:id="122"/>
+      <w:bookmarkEnd w:id="123"/>
+      <w:bookmarkEnd w:id="124"/>
+      <w:bookmarkEnd w:id="125"/>
     </w:p>
     <w:p>
       <w:r>
@@ -16918,57 +17432,57 @@
       <w:pPr>
         <w:pStyle w:val="4"/>
       </w:pPr>
-      <w:bookmarkStart w:id="123" w:name="_Toc14345915"/>
-      <w:bookmarkStart w:id="124" w:name="_Toc204949533"/>
-      <w:bookmarkStart w:id="125" w:name="_Toc507747250"/>
-      <w:bookmarkStart w:id="126" w:name="_Toc46909568"/>
-      <w:bookmarkStart w:id="127" w:name="_Toc172810451"/>
-      <w:bookmarkStart w:id="128" w:name="_Toc11620"/>
+      <w:bookmarkStart w:id="126" w:name="_Toc14345915"/>
+      <w:bookmarkStart w:id="127" w:name="_Toc204949533"/>
+      <w:bookmarkStart w:id="128" w:name="_Toc172810451"/>
+      <w:bookmarkStart w:id="129" w:name="_Toc11620"/>
+      <w:bookmarkStart w:id="130" w:name="_Toc46909568"/>
+      <w:bookmarkStart w:id="131" w:name="_Toc507747250"/>
       <w:r>
         <w:t>7.2.4 Estrutura Física do Banco de Dados</w:t>
       </w:r>
-      <w:bookmarkEnd w:id="123"/>
-      <w:bookmarkEnd w:id="124"/>
-      <w:bookmarkEnd w:id="125"/>
       <w:bookmarkEnd w:id="126"/>
       <w:bookmarkEnd w:id="127"/>
       <w:bookmarkEnd w:id="128"/>
-    </w:p>
-    <w:p>
-      <w:r>
-        <w:t xml:space="preserve">A estrutura física do banco de dados do sistema, contendo os </w:t>
-      </w:r>
-      <w:r>
-        <w:rPr>
-          <w:i/>
-        </w:rPr>
-        <w:t xml:space="preserve">scripts </w:t>
-      </w:r>
-      <w:r>
-        <w:t>de criação das tabelas (em DDL), bem como a definição de índices, views, triggers, procedures, tipos de usuários e permissões concedidas, está apresentada integralmente no Apêndice D. Este apêndice concentra todos os artefatos necessários para a implementação e manutenção do banco de dados, permitindo tanto a reprodução do ambiente quanto sua futura evolução.</w:t>
-      </w:r>
-    </w:p>
-    <w:p/>
-    <w:p>
-      <w:pPr>
-        <w:pStyle w:val="3"/>
-        <w:rPr>
-          <w:color w:val="0000FF"/>
-        </w:rPr>
-      </w:pPr>
-      <w:bookmarkStart w:id="129" w:name="_Toc14345921"/>
-      <w:bookmarkStart w:id="130" w:name="_Toc172810452"/>
-      <w:bookmarkStart w:id="131" w:name="_Toc204949534"/>
-      <w:bookmarkStart w:id="132" w:name="_Toc46909569"/>
-      <w:bookmarkStart w:id="133" w:name="_Toc4336"/>
-      <w:r>
-        <w:t>7.3 ANÁLISE DE COMPLEXIDADE ALGORÍTMICA</w:t>
-      </w:r>
       <w:bookmarkEnd w:id="129"/>
       <w:bookmarkEnd w:id="130"/>
       <w:bookmarkEnd w:id="131"/>
+    </w:p>
+    <w:p>
+      <w:r>
+        <w:t xml:space="preserve">A estrutura física do banco de dados do sistema, contendo os </w:t>
+      </w:r>
+      <w:r>
+        <w:rPr>
+          <w:i/>
+        </w:rPr>
+        <w:t xml:space="preserve">scripts </w:t>
+      </w:r>
+      <w:r>
+        <w:t>de criação das tabelas (em DDL), bem como a definição de índices, views, triggers, procedures, tipos de usuários e permissões concedidas, está apresentada integralmente no Apêndice D. Este apêndice concentra todos os artefatos necessários para a implementação e manutenção do banco de dados, permitindo tanto a reprodução do ambiente quanto sua futura evolução.</w:t>
+      </w:r>
+    </w:p>
+    <w:p/>
+    <w:p>
+      <w:pPr>
+        <w:pStyle w:val="3"/>
+        <w:rPr>
+          <w:color w:val="0000FF"/>
+        </w:rPr>
+      </w:pPr>
+      <w:bookmarkStart w:id="132" w:name="_Toc46909569"/>
+      <w:bookmarkStart w:id="133" w:name="_Toc4336"/>
+      <w:bookmarkStart w:id="134" w:name="_Toc14345921"/>
+      <w:bookmarkStart w:id="135" w:name="_Toc172810452"/>
+      <w:bookmarkStart w:id="136" w:name="_Toc204949534"/>
+      <w:r>
+        <w:t>7.3 ANÁLISE DE COMPLEXIDADE ALGORÍTMICA</w:t>
+      </w:r>
       <w:bookmarkEnd w:id="132"/>
       <w:bookmarkEnd w:id="133"/>
+      <w:bookmarkEnd w:id="134"/>
+      <w:bookmarkEnd w:id="135"/>
+      <w:bookmarkEnd w:id="136"/>
       <w:r>
         <w:t xml:space="preserve"> </w:t>
       </w:r>
@@ -17174,65 +17688,65 @@
       <w:pPr>
         <w:pStyle w:val="2"/>
       </w:pPr>
-      <w:bookmarkStart w:id="134" w:name="_Toc507747262"/>
-      <w:bookmarkStart w:id="135" w:name="_Toc172810453"/>
-      <w:bookmarkStart w:id="136" w:name="_Toc204949535"/>
-      <w:bookmarkStart w:id="137" w:name="_Toc14345929"/>
-      <w:bookmarkStart w:id="138" w:name="_Toc46909570"/>
-      <w:bookmarkStart w:id="139" w:name="_Toc26976"/>
+      <w:bookmarkStart w:id="137" w:name="_Toc172810453"/>
+      <w:bookmarkStart w:id="138" w:name="_Toc204949535"/>
+      <w:bookmarkStart w:id="139" w:name="_Toc14345929"/>
+      <w:bookmarkStart w:id="140" w:name="_Toc46909570"/>
+      <w:bookmarkStart w:id="141" w:name="_Toc507747262"/>
+      <w:bookmarkStart w:id="142" w:name="_Toc26976"/>
       <w:r>
         <w:t>8 PLANO DE TESTES</w:t>
       </w:r>
-      <w:bookmarkEnd w:id="134"/>
-      <w:bookmarkEnd w:id="135"/>
-      <w:bookmarkEnd w:id="136"/>
       <w:bookmarkEnd w:id="137"/>
       <w:bookmarkEnd w:id="138"/>
       <w:bookmarkEnd w:id="139"/>
-    </w:p>
-    <w:p>
-      <w:r>
-        <w:t xml:space="preserve">Com base na especificação, os testes são realizados para a validação frente aos requisitos especificados ou para verificação dos resultados da implementação. Um plano de testes precisa ser sistematizado com finalidade, escopo, casos de testes e registro dos resultados. </w:t>
-      </w:r>
-    </w:p>
-    <w:p>
-      <w:r>
-        <w:t>Este capítulo apresenta um dos planos de testes elaborado para o Sage.</w:t>
-      </w:r>
-    </w:p>
-    <w:p>
-      <w:pPr>
-        <w:rPr>
-          <w:rFonts w:eastAsia="Arial Unicode MS"/>
-          <w:color w:val="0000FF"/>
-        </w:rPr>
-      </w:pPr>
-    </w:p>
-    <w:p>
-      <w:pPr>
-        <w:pStyle w:val="3"/>
-        <w:rPr>
-          <w:rFonts w:eastAsia="Arial Unicode MS"/>
-        </w:rPr>
-      </w:pPr>
-      <w:bookmarkStart w:id="140" w:name="_Toc172810454"/>
-      <w:bookmarkStart w:id="141" w:name="_Toc507747263"/>
-      <w:bookmarkStart w:id="142" w:name="_Toc46909571"/>
-      <w:bookmarkStart w:id="143" w:name="_Toc204949536"/>
-      <w:bookmarkStart w:id="144" w:name="_Toc14345930"/>
-      <w:bookmarkStart w:id="145" w:name="_Toc7940"/>
-      <w:r>
-        <w:rPr>
-          <w:rFonts w:eastAsia="Arial Unicode MS"/>
-        </w:rPr>
-        <w:t>8.1 FINALIDADE</w:t>
-      </w:r>
       <w:bookmarkEnd w:id="140"/>
       <w:bookmarkEnd w:id="141"/>
       <w:bookmarkEnd w:id="142"/>
+    </w:p>
+    <w:p>
+      <w:r>
+        <w:t xml:space="preserve">Com base na especificação, os testes são realizados para a validação frente aos requisitos especificados ou para verificação dos resultados da implementação. Um plano de testes precisa ser sistematizado com finalidade, escopo, casos de testes e registro dos resultados. </w:t>
+      </w:r>
+    </w:p>
+    <w:p>
+      <w:r>
+        <w:t>Este capítulo apresenta um dos planos de testes elaborado para o Sage.</w:t>
+      </w:r>
+    </w:p>
+    <w:p>
+      <w:pPr>
+        <w:rPr>
+          <w:rFonts w:eastAsia="Arial Unicode MS"/>
+          <w:color w:val="0000FF"/>
+        </w:rPr>
+      </w:pPr>
+    </w:p>
+    <w:p>
+      <w:pPr>
+        <w:pStyle w:val="3"/>
+        <w:rPr>
+          <w:rFonts w:eastAsia="Arial Unicode MS"/>
+        </w:rPr>
+      </w:pPr>
+      <w:bookmarkStart w:id="143" w:name="_Toc14345930"/>
+      <w:bookmarkStart w:id="144" w:name="_Toc204949536"/>
+      <w:bookmarkStart w:id="145" w:name="_Toc507747263"/>
+      <w:bookmarkStart w:id="146" w:name="_Toc46909571"/>
+      <w:bookmarkStart w:id="147" w:name="_Toc172810454"/>
+      <w:bookmarkStart w:id="148" w:name="_Toc7940"/>
+      <w:r>
+        <w:rPr>
+          <w:rFonts w:eastAsia="Arial Unicode MS"/>
+        </w:rPr>
+        <w:t>8.1 FINALIDADE</w:t>
+      </w:r>
       <w:bookmarkEnd w:id="143"/>
       <w:bookmarkEnd w:id="144"/>
       <w:bookmarkEnd w:id="145"/>
+      <w:bookmarkEnd w:id="146"/>
+      <w:bookmarkEnd w:id="147"/>
+      <w:bookmarkEnd w:id="148"/>
     </w:p>
     <w:p>
       <w:pPr>
@@ -17477,11 +17991,11 @@
           <w:rFonts w:eastAsia="Arial Unicode MS"/>
         </w:rPr>
       </w:pPr>
-      <w:bookmarkStart w:id="146" w:name="_Toc14345931"/>
-      <w:bookmarkStart w:id="147" w:name="_Toc507747264"/>
-      <w:bookmarkStart w:id="148" w:name="_Toc46909572"/>
       <w:bookmarkStart w:id="149" w:name="_Toc172810455"/>
-      <w:bookmarkStart w:id="150" w:name="_Toc204949537"/>
+      <w:bookmarkStart w:id="150" w:name="_Toc507747264"/>
+      <w:bookmarkStart w:id="151" w:name="_Toc46909572"/>
+      <w:bookmarkStart w:id="152" w:name="_Toc204949537"/>
+      <w:bookmarkStart w:id="153" w:name="_Toc14345931"/>
     </w:p>
     <w:p>
       <w:pPr>
@@ -17490,19 +18004,19 @@
           <w:rFonts w:eastAsia="Arial Unicode MS"/>
         </w:rPr>
       </w:pPr>
-      <w:bookmarkStart w:id="151" w:name="_Toc10414"/>
+      <w:bookmarkStart w:id="154" w:name="_Toc10414"/>
       <w:r>
         <w:rPr>
           <w:rFonts w:eastAsia="Arial Unicode MS"/>
         </w:rPr>
         <w:t>8.2 ESCOPO</w:t>
       </w:r>
-      <w:bookmarkEnd w:id="146"/>
-      <w:bookmarkEnd w:id="147"/>
-      <w:bookmarkEnd w:id="148"/>
       <w:bookmarkEnd w:id="149"/>
       <w:bookmarkEnd w:id="150"/>
       <w:bookmarkEnd w:id="151"/>
+      <w:bookmarkEnd w:id="152"/>
+      <w:bookmarkEnd w:id="153"/>
+      <w:bookmarkEnd w:id="154"/>
     </w:p>
     <w:p>
       <w:pPr>
@@ -17767,21 +18281,21 @@
       <w:pPr>
         <w:pStyle w:val="4"/>
       </w:pPr>
-      <w:bookmarkStart w:id="152" w:name="_Toc507747265"/>
-      <w:bookmarkStart w:id="153" w:name="_Toc14345932"/>
-      <w:bookmarkStart w:id="154" w:name="_Toc204949538"/>
-      <w:bookmarkStart w:id="155" w:name="_Toc172810456"/>
-      <w:bookmarkStart w:id="156" w:name="_Toc46909573"/>
-      <w:bookmarkStart w:id="157" w:name="_Toc5534"/>
+      <w:bookmarkStart w:id="155" w:name="_Toc5534"/>
+      <w:bookmarkStart w:id="156" w:name="_Toc507747265"/>
+      <w:bookmarkStart w:id="157" w:name="_Toc14345932"/>
+      <w:bookmarkStart w:id="158" w:name="_Toc172810456"/>
+      <w:bookmarkStart w:id="159" w:name="_Toc46909573"/>
+      <w:bookmarkStart w:id="160" w:name="_Toc204949538"/>
       <w:r>
         <w:t>8.2.1 Referências aos Documentos Relevantes</w:t>
       </w:r>
-      <w:bookmarkEnd w:id="152"/>
-      <w:bookmarkEnd w:id="153"/>
-      <w:bookmarkEnd w:id="154"/>
       <w:bookmarkEnd w:id="155"/>
       <w:bookmarkEnd w:id="156"/>
       <w:bookmarkEnd w:id="157"/>
+      <w:bookmarkEnd w:id="158"/>
+      <w:bookmarkEnd w:id="159"/>
+      <w:bookmarkEnd w:id="160"/>
     </w:p>
     <w:tbl>
       <w:tblPr>
@@ -17952,8 +18466,8 @@
                 <w:rFonts w:eastAsia="Arial Unicode MS"/>
               </w:rPr>
             </w:pPr>
-            <w:bookmarkStart w:id="158" w:name="_Toc14343275"/>
-            <w:bookmarkStart w:id="159" w:name="_Toc507751104"/>
+            <w:bookmarkStart w:id="161" w:name="_Toc14343275"/>
+            <w:bookmarkStart w:id="162" w:name="_Toc507751104"/>
             <w:r>
               <w:rPr>
                 <w:rFonts w:eastAsia="Arial Unicode MS"/>
@@ -18012,9 +18526,9 @@
       <w:r>
         <w:t xml:space="preserve">   </w:t>
       </w:r>
-      <w:bookmarkStart w:id="160" w:name="_Toc204949481"/>
-      <w:bookmarkStart w:id="161" w:name="_Toc78782581"/>
-      <w:bookmarkStart w:id="162" w:name="_Toc172810391"/>
+      <w:bookmarkStart w:id="163" w:name="_Toc204949481"/>
+      <w:bookmarkStart w:id="164" w:name="_Toc78782581"/>
+      <w:bookmarkStart w:id="165" w:name="_Toc172810391"/>
       <w:r>
         <w:t xml:space="preserve">QUADRO </w:t>
       </w:r>
@@ -18039,41 +18553,41 @@
         </w:rPr>
         <w:t xml:space="preserve"> – Documentos relevantes para testes</w:t>
       </w:r>
-      <w:bookmarkEnd w:id="158"/>
-      <w:bookmarkEnd w:id="159"/>
-      <w:bookmarkEnd w:id="160"/>
       <w:bookmarkEnd w:id="161"/>
       <w:bookmarkEnd w:id="162"/>
-    </w:p>
-    <w:p>
-      <w:pPr>
-        <w:pStyle w:val="4"/>
-      </w:pPr>
-    </w:p>
-    <w:p>
-      <w:pPr>
-        <w:pStyle w:val="4"/>
-      </w:pPr>
-      <w:bookmarkStart w:id="163" w:name="_Toc191128985"/>
-      <w:bookmarkStart w:id="164" w:name="_Toc507747266"/>
-      <w:bookmarkStart w:id="165" w:name="_Toc172810457"/>
-      <w:bookmarkStart w:id="166" w:name="_Toc46909574"/>
-      <w:bookmarkStart w:id="167" w:name="_Toc204949539"/>
-      <w:bookmarkStart w:id="168" w:name="_Toc14345933"/>
-      <w:bookmarkStart w:id="169" w:name="_Toc21497"/>
-      <w:r>
-        <w:t>8.2.2 Ambiente</w:t>
-      </w:r>
       <w:bookmarkEnd w:id="163"/>
-      <w:r>
-        <w:t xml:space="preserve"> para a Realização dos Testes</w:t>
-      </w:r>
       <w:bookmarkEnd w:id="164"/>
       <w:bookmarkEnd w:id="165"/>
+    </w:p>
+    <w:p>
+      <w:pPr>
+        <w:pStyle w:val="4"/>
+      </w:pPr>
+    </w:p>
+    <w:p>
+      <w:pPr>
+        <w:pStyle w:val="4"/>
+      </w:pPr>
+      <w:bookmarkStart w:id="166" w:name="_Toc191128985"/>
+      <w:bookmarkStart w:id="167" w:name="_Toc14345933"/>
+      <w:bookmarkStart w:id="168" w:name="_Toc21497"/>
+      <w:bookmarkStart w:id="169" w:name="_Toc172810457"/>
+      <w:bookmarkStart w:id="170" w:name="_Toc204949539"/>
+      <w:bookmarkStart w:id="171" w:name="_Toc46909574"/>
+      <w:bookmarkStart w:id="172" w:name="_Toc507747266"/>
+      <w:r>
+        <w:t>8.2.2 Ambiente</w:t>
+      </w:r>
       <w:bookmarkEnd w:id="166"/>
+      <w:r>
+        <w:t xml:space="preserve"> para a Realização dos Testes</w:t>
+      </w:r>
       <w:bookmarkEnd w:id="167"/>
       <w:bookmarkEnd w:id="168"/>
       <w:bookmarkEnd w:id="169"/>
+      <w:bookmarkEnd w:id="170"/>
+      <w:bookmarkEnd w:id="171"/>
+      <w:bookmarkEnd w:id="172"/>
       <w:r>
         <w:t xml:space="preserve"> </w:t>
       </w:r>
@@ -18415,11 +18929,11 @@
         </w:rPr>
         <w:t xml:space="preserve">   </w:t>
       </w:r>
-      <w:bookmarkStart w:id="170" w:name="_Toc14343276"/>
-      <w:bookmarkStart w:id="171" w:name="_Toc78782582"/>
-      <w:bookmarkStart w:id="172" w:name="_Toc204949482"/>
-      <w:bookmarkStart w:id="173" w:name="_Toc507751105"/>
-      <w:bookmarkStart w:id="174" w:name="_Toc172810392"/>
+      <w:bookmarkStart w:id="173" w:name="_Toc204949482"/>
+      <w:bookmarkStart w:id="174" w:name="_Toc507751105"/>
+      <w:bookmarkStart w:id="175" w:name="_Toc78782582"/>
+      <w:bookmarkStart w:id="176" w:name="_Toc14343276"/>
+      <w:bookmarkStart w:id="177" w:name="_Toc172810392"/>
       <w:r>
         <w:t xml:space="preserve">QUADRO </w:t>
       </w:r>
@@ -18447,11 +18961,11 @@
       <w:r>
         <w:t xml:space="preserve"> Equipamentos  para a  realização dos testes</w:t>
       </w:r>
-      <w:bookmarkEnd w:id="170"/>
-      <w:bookmarkEnd w:id="171"/>
-      <w:bookmarkEnd w:id="172"/>
       <w:bookmarkEnd w:id="173"/>
       <w:bookmarkEnd w:id="174"/>
+      <w:bookmarkEnd w:id="175"/>
+      <w:bookmarkEnd w:id="176"/>
+      <w:bookmarkEnd w:id="177"/>
     </w:p>
     <w:tbl>
       <w:tblPr>
@@ -18659,7 +19173,7 @@
                 <w:rFonts w:eastAsia="Arial Unicode MS"/>
               </w:rPr>
             </w:pPr>
-            <w:bookmarkStart w:id="175" w:name="_Toc191128994"/>
+            <w:bookmarkStart w:id="178" w:name="_Toc191128994"/>
             <w:r>
               <w:rPr>
                 <w:rFonts w:eastAsia="Arial Unicode MS"/>
@@ -18791,11 +19305,11 @@
         </w:rPr>
         <w:t xml:space="preserve">   </w:t>
       </w:r>
-      <w:bookmarkStart w:id="176" w:name="_Toc204949483"/>
-      <w:bookmarkStart w:id="177" w:name="_Toc507751106"/>
-      <w:bookmarkStart w:id="178" w:name="_Toc78782583"/>
-      <w:bookmarkStart w:id="179" w:name="_Toc172810393"/>
-      <w:bookmarkStart w:id="180" w:name="_Toc14343277"/>
+      <w:bookmarkStart w:id="179" w:name="_Toc507751106"/>
+      <w:bookmarkStart w:id="180" w:name="_Toc78782583"/>
+      <w:bookmarkStart w:id="181" w:name="_Toc172810393"/>
+      <w:bookmarkStart w:id="182" w:name="_Toc204949483"/>
+      <w:bookmarkStart w:id="183" w:name="_Toc14343277"/>
       <w:r>
         <w:t xml:space="preserve">QUADRO </w:t>
       </w:r>
@@ -18823,72 +19337,72 @@
       <w:r>
         <w:t xml:space="preserve"> Softwares para a  realização dos testes</w:t>
       </w:r>
-      <w:bookmarkEnd w:id="176"/>
-      <w:bookmarkEnd w:id="177"/>
-      <w:bookmarkEnd w:id="178"/>
       <w:bookmarkEnd w:id="179"/>
       <w:bookmarkEnd w:id="180"/>
-    </w:p>
-    <w:p>
-      <w:pPr>
-        <w:rPr>
-          <w:color w:val="0000FF"/>
-        </w:rPr>
-      </w:pPr>
-    </w:p>
-    <w:p>
-      <w:pPr>
-        <w:pStyle w:val="3"/>
-      </w:pPr>
-      <w:bookmarkStart w:id="181" w:name="_Toc507747267"/>
-      <w:bookmarkStart w:id="182" w:name="_Toc204949540"/>
-      <w:bookmarkStart w:id="183" w:name="_Toc46909575"/>
-      <w:bookmarkStart w:id="184" w:name="_Toc172810458"/>
-      <w:bookmarkStart w:id="185" w:name="_Toc14345934"/>
-      <w:bookmarkStart w:id="186" w:name="_Toc24724"/>
-      <w:r>
-        <w:t>8.3 ESPECIFICAÇÃO DOS CASOS DE TESTES</w:t>
-      </w:r>
       <w:bookmarkEnd w:id="181"/>
       <w:bookmarkEnd w:id="182"/>
       <w:bookmarkEnd w:id="183"/>
+    </w:p>
+    <w:p>
+      <w:pPr>
+        <w:rPr>
+          <w:color w:val="0000FF"/>
+        </w:rPr>
+      </w:pPr>
+    </w:p>
+    <w:p>
+      <w:pPr>
+        <w:pStyle w:val="3"/>
+      </w:pPr>
+      <w:bookmarkStart w:id="184" w:name="_Toc507747267"/>
+      <w:bookmarkStart w:id="185" w:name="_Toc14345934"/>
+      <w:bookmarkStart w:id="186" w:name="_Toc24724"/>
+      <w:bookmarkStart w:id="187" w:name="_Toc46909575"/>
+      <w:bookmarkStart w:id="188" w:name="_Toc204949540"/>
+      <w:bookmarkStart w:id="189" w:name="_Toc172810458"/>
+      <w:r>
+        <w:t>8.3 ESPECIFICAÇÃO DOS CASOS DE TESTES</w:t>
+      </w:r>
       <w:bookmarkEnd w:id="184"/>
       <w:bookmarkEnd w:id="185"/>
       <w:bookmarkEnd w:id="186"/>
-    </w:p>
-    <w:bookmarkEnd w:id="175"/>
-    <w:p>
-      <w:r>
-        <w:t>A descrição dos casos de testes e a demonstração dos resultados obtidos na realização de uma bateria constam no Apêndice J.</w:t>
-      </w:r>
-    </w:p>
-    <w:p>
-      <w:pPr>
-        <w:pStyle w:val="3"/>
-        <w:rPr>
-          <w:color w:val="0000FF"/>
-        </w:rPr>
-      </w:pPr>
-      <w:bookmarkStart w:id="187" w:name="_Toc507747271"/>
-      <w:bookmarkStart w:id="188" w:name="_Toc46909579"/>
-      <w:bookmarkStart w:id="189" w:name="_Toc14345938"/>
-    </w:p>
-    <w:p>
-      <w:pPr>
-        <w:pStyle w:val="3"/>
-      </w:pPr>
-      <w:bookmarkStart w:id="190" w:name="_Toc172810459"/>
-      <w:bookmarkStart w:id="191" w:name="_Toc204949541"/>
-      <w:bookmarkStart w:id="192" w:name="_Toc7727"/>
-      <w:r>
-        <w:t>8.4 RESULTADOS DOS TESTES</w:t>
-      </w:r>
       <w:bookmarkEnd w:id="187"/>
       <w:bookmarkEnd w:id="188"/>
       <w:bookmarkEnd w:id="189"/>
+    </w:p>
+    <w:bookmarkEnd w:id="178"/>
+    <w:p>
+      <w:r>
+        <w:t>A descrição dos casos de testes e a demonstração dos resultados obtidos na realização de uma bateria constam no Apêndice J.</w:t>
+      </w:r>
+    </w:p>
+    <w:p>
+      <w:pPr>
+        <w:pStyle w:val="3"/>
+        <w:rPr>
+          <w:color w:val="0000FF"/>
+        </w:rPr>
+      </w:pPr>
+      <w:bookmarkStart w:id="190" w:name="_Toc507747271"/>
+      <w:bookmarkStart w:id="191" w:name="_Toc46909579"/>
+      <w:bookmarkStart w:id="192" w:name="_Toc14345938"/>
+    </w:p>
+    <w:p>
+      <w:pPr>
+        <w:pStyle w:val="3"/>
+      </w:pPr>
+      <w:bookmarkStart w:id="193" w:name="_Toc7727"/>
+      <w:bookmarkStart w:id="194" w:name="_Toc204949541"/>
+      <w:bookmarkStart w:id="195" w:name="_Toc172810459"/>
+      <w:r>
+        <w:t>8.4 RESULTADOS DOS TESTES</w:t>
+      </w:r>
       <w:bookmarkEnd w:id="190"/>
       <w:bookmarkEnd w:id="191"/>
       <w:bookmarkEnd w:id="192"/>
+      <w:bookmarkEnd w:id="193"/>
+      <w:bookmarkEnd w:id="194"/>
+      <w:bookmarkEnd w:id="195"/>
     </w:p>
     <w:p>
       <w:r>
@@ -18946,161 +19460,161 @@
           <w:color w:val="0000FF"/>
         </w:rPr>
       </w:pPr>
-      <w:bookmarkStart w:id="193" w:name="_Toc46909582"/>
-      <w:bookmarkStart w:id="194" w:name="_Toc507747274"/>
-      <w:bookmarkStart w:id="195" w:name="_Toc172810460"/>
-      <w:bookmarkStart w:id="196" w:name="_Toc14345941"/>
+      <w:bookmarkStart w:id="196" w:name="_Toc19401"/>
       <w:bookmarkStart w:id="197" w:name="_Toc204949542"/>
-      <w:bookmarkStart w:id="198" w:name="_Toc19401"/>
+      <w:bookmarkStart w:id="198" w:name="_Toc46909582"/>
+      <w:bookmarkStart w:id="199" w:name="_Toc507747274"/>
+      <w:bookmarkStart w:id="200" w:name="_Toc172810460"/>
+      <w:bookmarkStart w:id="201" w:name="_Toc14345941"/>
       <w:r>
         <w:rPr>
           <w:color w:val="0000FF"/>
         </w:rPr>
         <w:t>9 PLANO PARA IMPLANTAÇÃO</w:t>
       </w:r>
-      <w:bookmarkEnd w:id="193"/>
-      <w:bookmarkEnd w:id="194"/>
-      <w:bookmarkEnd w:id="195"/>
       <w:bookmarkEnd w:id="196"/>
       <w:bookmarkEnd w:id="197"/>
       <w:bookmarkEnd w:id="198"/>
-    </w:p>
-    <w:p>
-      <w:pPr>
-        <w:rPr>
-          <w:color w:val="0000FF"/>
-        </w:rPr>
-      </w:pPr>
-      <w:r>
-        <w:rPr>
-          <w:color w:val="0000FF"/>
-        </w:rPr>
-        <w:t>A implantação cobre o período em que versões do sistema de software são disponibilizadas à sua comunidade de usuários. Preencha as seções que explicam uma possível implantação do sistema de software implementado.</w:t>
-      </w:r>
-    </w:p>
-    <w:p>
-      <w:pPr>
-        <w:pStyle w:val="3"/>
-        <w:rPr>
-          <w:rFonts w:eastAsia="Arial Unicode MS"/>
-          <w:color w:val="0000FF"/>
-        </w:rPr>
-      </w:pPr>
-    </w:p>
-    <w:p>
-      <w:pPr>
-        <w:pStyle w:val="3"/>
-        <w:rPr>
-          <w:rFonts w:eastAsia="Arial Unicode MS"/>
-          <w:color w:val="0000FF"/>
-        </w:rPr>
-      </w:pPr>
-      <w:bookmarkStart w:id="199" w:name="_Toc172810461"/>
-      <w:bookmarkStart w:id="200" w:name="_Toc507747275"/>
-      <w:bookmarkStart w:id="201" w:name="_Toc14345942"/>
-      <w:bookmarkStart w:id="202" w:name="_Toc46909583"/>
-      <w:bookmarkStart w:id="203" w:name="_Toc204949543"/>
-      <w:bookmarkStart w:id="204" w:name="_Toc7594"/>
-      <w:r>
-        <w:rPr>
-          <w:rFonts w:eastAsia="Arial Unicode MS"/>
-          <w:color w:val="0000FF"/>
-        </w:rPr>
-        <w:t>9.1 METODOLOGIA</w:t>
-      </w:r>
       <w:bookmarkEnd w:id="199"/>
       <w:bookmarkEnd w:id="200"/>
       <w:bookmarkEnd w:id="201"/>
+    </w:p>
+    <w:p>
+      <w:pPr>
+        <w:rPr>
+          <w:color w:val="0000FF"/>
+        </w:rPr>
+      </w:pPr>
+      <w:r>
+        <w:rPr>
+          <w:color w:val="0000FF"/>
+        </w:rPr>
+        <w:t>A implantação cobre o período em que versões do sistema de software são disponibilizadas à sua comunidade de usuários. Preencha as seções que explicam uma possível implantação do sistema de software implementado.</w:t>
+      </w:r>
+    </w:p>
+    <w:p>
+      <w:pPr>
+        <w:pStyle w:val="3"/>
+        <w:rPr>
+          <w:rFonts w:eastAsia="Arial Unicode MS"/>
+          <w:color w:val="0000FF"/>
+        </w:rPr>
+      </w:pPr>
+    </w:p>
+    <w:p>
+      <w:pPr>
+        <w:pStyle w:val="3"/>
+        <w:rPr>
+          <w:rFonts w:eastAsia="Arial Unicode MS"/>
+          <w:color w:val="0000FF"/>
+        </w:rPr>
+      </w:pPr>
+      <w:bookmarkStart w:id="202" w:name="_Toc46909583"/>
+      <w:bookmarkStart w:id="203" w:name="_Toc14345942"/>
+      <w:bookmarkStart w:id="204" w:name="_Toc7594"/>
+      <w:bookmarkStart w:id="205" w:name="_Toc507747275"/>
+      <w:bookmarkStart w:id="206" w:name="_Toc204949543"/>
+      <w:bookmarkStart w:id="207" w:name="_Toc172810461"/>
+      <w:r>
+        <w:rPr>
+          <w:rFonts w:eastAsia="Arial Unicode MS"/>
+          <w:color w:val="0000FF"/>
+        </w:rPr>
+        <w:t>9.1 METODOLOGIA</w:t>
+      </w:r>
       <w:bookmarkEnd w:id="202"/>
       <w:bookmarkEnd w:id="203"/>
       <w:bookmarkEnd w:id="204"/>
-      <w:r>
-        <w:rPr>
-          <w:rFonts w:eastAsia="Arial Unicode MS"/>
-          <w:color w:val="0000FF"/>
-        </w:rPr>
-        <w:t xml:space="preserve">  </w:t>
-      </w:r>
-    </w:p>
-    <w:p>
-      <w:pPr>
-        <w:rPr>
-          <w:color w:val="0000FF"/>
-        </w:rPr>
-      </w:pPr>
-      <w:r>
-        <w:rPr>
-          <w:color w:val="0000FF"/>
-        </w:rPr>
-        <w:t>Insira uma apresentação sobre a sequência metodológica utilizada para a implantação.</w:t>
-      </w:r>
-    </w:p>
-    <w:p>
-      <w:pPr>
-        <w:rPr>
-          <w:color w:val="0000FF"/>
-        </w:rPr>
-      </w:pPr>
-    </w:p>
-    <w:p>
-      <w:pPr>
-        <w:pStyle w:val="4"/>
-      </w:pPr>
-      <w:bookmarkStart w:id="205" w:name="_Toc172810462"/>
-      <w:bookmarkStart w:id="206" w:name="_Toc204949544"/>
-      <w:bookmarkStart w:id="207" w:name="_Toc507747276"/>
-      <w:bookmarkStart w:id="208" w:name="_Toc14345943"/>
-      <w:bookmarkStart w:id="209" w:name="_Toc46909584"/>
-      <w:bookmarkStart w:id="210" w:name="_Toc11817"/>
-      <w:r>
-        <w:t>9.1.1 Descrição da Metodologia</w:t>
-      </w:r>
       <w:bookmarkEnd w:id="205"/>
       <w:bookmarkEnd w:id="206"/>
       <w:bookmarkEnd w:id="207"/>
+      <w:r>
+        <w:rPr>
+          <w:rFonts w:eastAsia="Arial Unicode MS"/>
+          <w:color w:val="0000FF"/>
+        </w:rPr>
+        <w:t xml:space="preserve">  </w:t>
+      </w:r>
+    </w:p>
+    <w:p>
+      <w:pPr>
+        <w:rPr>
+          <w:color w:val="0000FF"/>
+        </w:rPr>
+      </w:pPr>
+      <w:r>
+        <w:rPr>
+          <w:color w:val="0000FF"/>
+        </w:rPr>
+        <w:t>Insira uma apresentação sobre a sequência metodológica utilizada para a implantação.</w:t>
+      </w:r>
+    </w:p>
+    <w:p>
+      <w:pPr>
+        <w:rPr>
+          <w:color w:val="0000FF"/>
+        </w:rPr>
+      </w:pPr>
+    </w:p>
+    <w:p>
+      <w:pPr>
+        <w:pStyle w:val="4"/>
+      </w:pPr>
+      <w:bookmarkStart w:id="208" w:name="_Toc204949544"/>
+      <w:bookmarkStart w:id="209" w:name="_Toc46909584"/>
+      <w:bookmarkStart w:id="210" w:name="_Toc507747276"/>
+      <w:bookmarkStart w:id="211" w:name="_Toc14345943"/>
+      <w:bookmarkStart w:id="212" w:name="_Toc172810462"/>
+      <w:bookmarkStart w:id="213" w:name="_Toc11817"/>
+      <w:r>
+        <w:t>9.1.1 Descrição da Metodologia</w:t>
+      </w:r>
       <w:bookmarkEnd w:id="208"/>
       <w:bookmarkEnd w:id="209"/>
       <w:bookmarkEnd w:id="210"/>
-    </w:p>
-    <w:p>
-      <w:pPr>
-        <w:rPr>
-          <w:color w:val="0000FF"/>
-        </w:rPr>
-      </w:pPr>
-      <w:r>
-        <w:rPr>
-          <w:color w:val="0000FF"/>
-        </w:rPr>
-        <w:t xml:space="preserve">Determine como será a implantação e a sua sequência. </w:t>
-      </w:r>
-    </w:p>
-    <w:p>
-      <w:pPr>
-        <w:rPr>
-          <w:color w:val="0000FF"/>
-        </w:rPr>
-      </w:pPr>
-    </w:p>
-    <w:p>
-      <w:pPr>
-        <w:pStyle w:val="4"/>
-      </w:pPr>
-      <w:bookmarkStart w:id="211" w:name="_Toc204949545"/>
-      <w:bookmarkStart w:id="212" w:name="_Toc507747277"/>
-      <w:bookmarkStart w:id="213" w:name="_Toc172810463"/>
-      <w:bookmarkStart w:id="214" w:name="_Toc46909585"/>
-      <w:bookmarkStart w:id="215" w:name="_Toc14345944"/>
-      <w:bookmarkStart w:id="216" w:name="_Toc26554"/>
-      <w:r>
-        <w:t>9.1.2 Matriz de Responsabilidade</w:t>
-      </w:r>
       <w:bookmarkEnd w:id="211"/>
       <w:bookmarkEnd w:id="212"/>
       <w:bookmarkEnd w:id="213"/>
+    </w:p>
+    <w:p>
+      <w:pPr>
+        <w:rPr>
+          <w:color w:val="0000FF"/>
+        </w:rPr>
+      </w:pPr>
+      <w:r>
+        <w:rPr>
+          <w:color w:val="0000FF"/>
+        </w:rPr>
+        <w:t xml:space="preserve">Determine como será a implantação e a sua sequência. </w:t>
+      </w:r>
+    </w:p>
+    <w:p>
+      <w:pPr>
+        <w:rPr>
+          <w:color w:val="0000FF"/>
+        </w:rPr>
+      </w:pPr>
+    </w:p>
+    <w:p>
+      <w:pPr>
+        <w:pStyle w:val="4"/>
+      </w:pPr>
+      <w:bookmarkStart w:id="214" w:name="_Toc507747277"/>
+      <w:bookmarkStart w:id="215" w:name="_Toc172810463"/>
+      <w:bookmarkStart w:id="216" w:name="_Toc204949545"/>
+      <w:bookmarkStart w:id="217" w:name="_Toc46909585"/>
+      <w:bookmarkStart w:id="218" w:name="_Toc14345944"/>
+      <w:bookmarkStart w:id="219" w:name="_Toc26554"/>
+      <w:r>
+        <w:t>9.1.2 Matriz de Responsabilidade</w:t>
+      </w:r>
       <w:bookmarkEnd w:id="214"/>
       <w:bookmarkEnd w:id="215"/>
       <w:bookmarkEnd w:id="216"/>
+      <w:bookmarkEnd w:id="217"/>
+      <w:bookmarkEnd w:id="218"/>
+      <w:bookmarkEnd w:id="219"/>
     </w:p>
     <w:p>
       <w:pPr>
@@ -20237,11 +20751,11 @@
           <w:color w:val="0000FF"/>
         </w:rPr>
       </w:pPr>
-      <w:bookmarkStart w:id="217" w:name="_Toc172810394"/>
-      <w:bookmarkStart w:id="218" w:name="_Toc78782587"/>
-      <w:bookmarkStart w:id="219" w:name="_Toc204949484"/>
-      <w:bookmarkStart w:id="220" w:name="_Toc507751111"/>
+      <w:bookmarkStart w:id="220" w:name="_Toc172810394"/>
       <w:bookmarkStart w:id="221" w:name="_Toc14343281"/>
+      <w:bookmarkStart w:id="222" w:name="_Toc78782587"/>
+      <w:bookmarkStart w:id="223" w:name="_Toc507751111"/>
+      <w:bookmarkStart w:id="224" w:name="_Toc204949484"/>
       <w:r>
         <w:rPr>
           <w:color w:val="0000FF"/>
@@ -20284,44 +20798,44 @@
         </w:rPr>
         <w:t xml:space="preserve"> – Papéis e responsabilidades na implantação</w:t>
       </w:r>
-      <w:bookmarkEnd w:id="217"/>
-      <w:bookmarkEnd w:id="218"/>
-      <w:bookmarkEnd w:id="219"/>
       <w:bookmarkEnd w:id="220"/>
       <w:bookmarkEnd w:id="221"/>
-    </w:p>
-    <w:p>
-      <w:pPr>
-        <w:rPr>
-          <w:color w:val="0000FF"/>
-        </w:rPr>
-      </w:pPr>
-    </w:p>
-    <w:p>
-      <w:pPr>
-        <w:pStyle w:val="3"/>
-        <w:rPr>
-          <w:color w:val="0000FF"/>
-        </w:rPr>
-      </w:pPr>
-      <w:bookmarkStart w:id="222" w:name="_Toc46909586"/>
-      <w:bookmarkStart w:id="223" w:name="_Toc14345945"/>
-      <w:bookmarkStart w:id="224" w:name="_Toc204949546"/>
-      <w:bookmarkStart w:id="225" w:name="_Toc507747278"/>
-      <w:bookmarkStart w:id="226" w:name="_Toc172810464"/>
-      <w:bookmarkStart w:id="227" w:name="_Toc16781"/>
-      <w:r>
-        <w:rPr>
-          <w:color w:val="0000FF"/>
-        </w:rPr>
-        <w:t>9.2 TREINAMENTO PREVISTO</w:t>
-      </w:r>
       <w:bookmarkEnd w:id="222"/>
       <w:bookmarkEnd w:id="223"/>
       <w:bookmarkEnd w:id="224"/>
+    </w:p>
+    <w:p>
+      <w:pPr>
+        <w:rPr>
+          <w:color w:val="0000FF"/>
+        </w:rPr>
+      </w:pPr>
+    </w:p>
+    <w:p>
+      <w:pPr>
+        <w:pStyle w:val="3"/>
+        <w:rPr>
+          <w:color w:val="0000FF"/>
+        </w:rPr>
+      </w:pPr>
+      <w:bookmarkStart w:id="225" w:name="_Toc46909586"/>
+      <w:bookmarkStart w:id="226" w:name="_Toc204949546"/>
+      <w:bookmarkStart w:id="227" w:name="_Toc507747278"/>
+      <w:bookmarkStart w:id="228" w:name="_Toc14345945"/>
+      <w:bookmarkStart w:id="229" w:name="_Toc172810464"/>
+      <w:bookmarkStart w:id="230" w:name="_Toc16781"/>
+      <w:r>
+        <w:rPr>
+          <w:color w:val="0000FF"/>
+        </w:rPr>
+        <w:t>9.2 TREINAMENTO PREVISTO</w:t>
+      </w:r>
       <w:bookmarkEnd w:id="225"/>
       <w:bookmarkEnd w:id="226"/>
       <w:bookmarkEnd w:id="227"/>
+      <w:bookmarkEnd w:id="228"/>
+      <w:bookmarkEnd w:id="229"/>
+      <w:bookmarkEnd w:id="230"/>
     </w:p>
     <w:p>
       <w:pPr>
@@ -20521,11 +21035,11 @@
           <w:color w:val="0000FF"/>
         </w:rPr>
       </w:pPr>
-      <w:bookmarkStart w:id="228" w:name="_Toc172810395"/>
-      <w:bookmarkStart w:id="229" w:name="_Toc14343282"/>
-      <w:bookmarkStart w:id="230" w:name="_Toc507751112"/>
-      <w:bookmarkStart w:id="231" w:name="_Toc204949485"/>
-      <w:bookmarkStart w:id="232" w:name="_Toc78782588"/>
+      <w:bookmarkStart w:id="231" w:name="_Toc14343282"/>
+      <w:bookmarkStart w:id="232" w:name="_Toc172810395"/>
+      <w:bookmarkStart w:id="233" w:name="_Toc507751112"/>
+      <w:bookmarkStart w:id="234" w:name="_Toc78782588"/>
+      <w:bookmarkStart w:id="235" w:name="_Toc204949485"/>
       <w:r>
         <w:rPr>
           <w:color w:val="0000FF"/>
@@ -20568,45 +21082,45 @@
         </w:rPr>
         <w:t xml:space="preserve"> – Treinamentos previstos</w:t>
       </w:r>
-      <w:bookmarkEnd w:id="228"/>
-      <w:bookmarkEnd w:id="229"/>
-      <w:bookmarkEnd w:id="230"/>
       <w:bookmarkEnd w:id="231"/>
       <w:bookmarkEnd w:id="232"/>
-    </w:p>
-    <w:p>
-      <w:pPr>
-        <w:pStyle w:val="3"/>
-        <w:rPr>
-          <w:color w:val="0000FF"/>
-        </w:rPr>
-      </w:pPr>
-    </w:p>
-    <w:p>
-      <w:pPr>
-        <w:pStyle w:val="3"/>
-        <w:rPr>
-          <w:color w:val="0000FF"/>
-        </w:rPr>
-      </w:pPr>
-      <w:bookmarkStart w:id="233" w:name="_Toc507747279"/>
-      <w:bookmarkStart w:id="234" w:name="_Toc204949547"/>
-      <w:bookmarkStart w:id="235" w:name="_Toc46909587"/>
-      <w:bookmarkStart w:id="236" w:name="_Toc14345946"/>
-      <w:bookmarkStart w:id="237" w:name="_Toc172810465"/>
-      <w:bookmarkStart w:id="238" w:name="_Toc2417"/>
-      <w:r>
-        <w:rPr>
-          <w:color w:val="0000FF"/>
-        </w:rPr>
-        <w:t>9.3 CRONOGRAMA DE IMPLANTAÇÃO</w:t>
-      </w:r>
       <w:bookmarkEnd w:id="233"/>
       <w:bookmarkEnd w:id="234"/>
       <w:bookmarkEnd w:id="235"/>
+    </w:p>
+    <w:p>
+      <w:pPr>
+        <w:pStyle w:val="3"/>
+        <w:rPr>
+          <w:color w:val="0000FF"/>
+        </w:rPr>
+      </w:pPr>
+    </w:p>
+    <w:p>
+      <w:pPr>
+        <w:pStyle w:val="3"/>
+        <w:rPr>
+          <w:color w:val="0000FF"/>
+        </w:rPr>
+      </w:pPr>
+      <w:bookmarkStart w:id="236" w:name="_Toc507747279"/>
+      <w:bookmarkStart w:id="237" w:name="_Toc172810465"/>
+      <w:bookmarkStart w:id="238" w:name="_Toc14345946"/>
+      <w:bookmarkStart w:id="239" w:name="_Toc204949547"/>
+      <w:bookmarkStart w:id="240" w:name="_Toc46909587"/>
+      <w:bookmarkStart w:id="241" w:name="_Toc2417"/>
+      <w:r>
+        <w:rPr>
+          <w:color w:val="0000FF"/>
+        </w:rPr>
+        <w:t>9.3 CRONOGRAMA DE IMPLANTAÇÃO</w:t>
+      </w:r>
       <w:bookmarkEnd w:id="236"/>
       <w:bookmarkEnd w:id="237"/>
       <w:bookmarkEnd w:id="238"/>
+      <w:bookmarkEnd w:id="239"/>
+      <w:bookmarkEnd w:id="240"/>
+      <w:bookmarkEnd w:id="241"/>
     </w:p>
     <w:p>
       <w:pPr>
@@ -20867,11 +21381,11 @@
           <w:color w:val="0000FF"/>
         </w:rPr>
       </w:pPr>
-      <w:bookmarkStart w:id="239" w:name="_Toc172810396"/>
-      <w:bookmarkStart w:id="240" w:name="_Toc14343283"/>
-      <w:bookmarkStart w:id="241" w:name="_Toc204949486"/>
-      <w:bookmarkStart w:id="242" w:name="_Toc507751113"/>
-      <w:bookmarkStart w:id="243" w:name="_Toc78782589"/>
+      <w:bookmarkStart w:id="242" w:name="_Toc14343283"/>
+      <w:bookmarkStart w:id="243" w:name="_Toc507751113"/>
+      <w:bookmarkStart w:id="244" w:name="_Toc204949486"/>
+      <w:bookmarkStart w:id="245" w:name="_Toc78782589"/>
+      <w:bookmarkStart w:id="246" w:name="_Toc172810396"/>
       <w:r>
         <w:rPr>
           <w:color w:val="0000FF"/>
@@ -20914,45 +21428,45 @@
         </w:rPr>
         <w:t xml:space="preserve"> – Cronograma de atividades da implantação</w:t>
       </w:r>
-      <w:bookmarkEnd w:id="239"/>
-      <w:bookmarkEnd w:id="240"/>
-      <w:bookmarkEnd w:id="241"/>
       <w:bookmarkEnd w:id="242"/>
       <w:bookmarkEnd w:id="243"/>
-    </w:p>
-    <w:p>
-      <w:pPr>
-        <w:pStyle w:val="3"/>
-        <w:rPr>
-          <w:color w:val="0000FF"/>
-        </w:rPr>
-      </w:pPr>
-    </w:p>
-    <w:p>
-      <w:pPr>
-        <w:pStyle w:val="3"/>
-        <w:rPr>
-          <w:color w:val="0000FF"/>
-        </w:rPr>
-      </w:pPr>
-      <w:bookmarkStart w:id="244" w:name="_Toc507747280"/>
-      <w:bookmarkStart w:id="245" w:name="_Toc204949548"/>
-      <w:bookmarkStart w:id="246" w:name="_Toc172810466"/>
-      <w:bookmarkStart w:id="247" w:name="_Toc14345947"/>
-      <w:bookmarkStart w:id="248" w:name="_Toc46909588"/>
-      <w:bookmarkStart w:id="249" w:name="_Toc14039"/>
-      <w:r>
-        <w:rPr>
-          <w:color w:val="0000FF"/>
-        </w:rPr>
-        <w:t>9.4 RECURSOS DE APOIO À IMPLANTAÇÃO</w:t>
-      </w:r>
       <w:bookmarkEnd w:id="244"/>
       <w:bookmarkEnd w:id="245"/>
       <w:bookmarkEnd w:id="246"/>
+    </w:p>
+    <w:p>
+      <w:pPr>
+        <w:pStyle w:val="3"/>
+        <w:rPr>
+          <w:color w:val="0000FF"/>
+        </w:rPr>
+      </w:pPr>
+    </w:p>
+    <w:p>
+      <w:pPr>
+        <w:pStyle w:val="3"/>
+        <w:rPr>
+          <w:color w:val="0000FF"/>
+        </w:rPr>
+      </w:pPr>
+      <w:bookmarkStart w:id="247" w:name="_Toc172810466"/>
+      <w:bookmarkStart w:id="248" w:name="_Toc204949548"/>
+      <w:bookmarkStart w:id="249" w:name="_Toc46909588"/>
+      <w:bookmarkStart w:id="250" w:name="_Toc14039"/>
+      <w:bookmarkStart w:id="251" w:name="_Toc507747280"/>
+      <w:bookmarkStart w:id="252" w:name="_Toc14345947"/>
+      <w:r>
+        <w:rPr>
+          <w:color w:val="0000FF"/>
+        </w:rPr>
+        <w:t>9.4 RECURSOS DE APOIO À IMPLANTAÇÃO</w:t>
+      </w:r>
       <w:bookmarkEnd w:id="247"/>
       <w:bookmarkEnd w:id="248"/>
       <w:bookmarkEnd w:id="249"/>
+      <w:bookmarkEnd w:id="250"/>
+      <w:bookmarkEnd w:id="251"/>
+      <w:bookmarkEnd w:id="252"/>
     </w:p>
     <w:p>
       <w:pPr>
@@ -21286,11 +21800,11 @@
           <w:color w:val="0000FF"/>
         </w:rPr>
       </w:pPr>
-      <w:bookmarkStart w:id="250" w:name="_Toc507751114"/>
-      <w:bookmarkStart w:id="251" w:name="_Toc14343284"/>
-      <w:bookmarkStart w:id="252" w:name="_Toc204949487"/>
-      <w:bookmarkStart w:id="253" w:name="_Toc172810397"/>
-      <w:bookmarkStart w:id="254" w:name="_Toc78782590"/>
+      <w:bookmarkStart w:id="253" w:name="_Toc78782590"/>
+      <w:bookmarkStart w:id="254" w:name="_Toc172810397"/>
+      <w:bookmarkStart w:id="255" w:name="_Toc204949487"/>
+      <w:bookmarkStart w:id="256" w:name="_Toc507751114"/>
+      <w:bookmarkStart w:id="257" w:name="_Toc14343284"/>
       <w:r>
         <w:rPr>
           <w:color w:val="0000FF"/>
@@ -21333,45 +21847,45 @@
         </w:rPr>
         <w:t xml:space="preserve"> – Recursos de apoio à implantação</w:t>
       </w:r>
-      <w:bookmarkEnd w:id="250"/>
-      <w:bookmarkEnd w:id="251"/>
-      <w:bookmarkEnd w:id="252"/>
       <w:bookmarkEnd w:id="253"/>
       <w:bookmarkEnd w:id="254"/>
-    </w:p>
-    <w:p>
-      <w:pPr>
-        <w:pStyle w:val="3"/>
-        <w:rPr>
-          <w:color w:val="0000FF"/>
-        </w:rPr>
-      </w:pPr>
-    </w:p>
-    <w:p>
-      <w:pPr>
-        <w:pStyle w:val="3"/>
-        <w:rPr>
-          <w:color w:val="0000FF"/>
-        </w:rPr>
-      </w:pPr>
-      <w:bookmarkStart w:id="255" w:name="_Toc46909589"/>
-      <w:bookmarkStart w:id="256" w:name="_Toc204949549"/>
-      <w:bookmarkStart w:id="257" w:name="_Toc507747281"/>
-      <w:bookmarkStart w:id="258" w:name="_Toc172810467"/>
-      <w:bookmarkStart w:id="259" w:name="_Toc14345948"/>
-      <w:bookmarkStart w:id="260" w:name="_Toc20450"/>
-      <w:r>
-        <w:rPr>
-          <w:color w:val="0000FF"/>
-        </w:rPr>
-        <w:t>9.5 VISÃO DA IMPLANTAÇÃO</w:t>
-      </w:r>
       <w:bookmarkEnd w:id="255"/>
       <w:bookmarkEnd w:id="256"/>
       <w:bookmarkEnd w:id="257"/>
+    </w:p>
+    <w:p>
+      <w:pPr>
+        <w:pStyle w:val="3"/>
+        <w:rPr>
+          <w:color w:val="0000FF"/>
+        </w:rPr>
+      </w:pPr>
+    </w:p>
+    <w:p>
+      <w:pPr>
+        <w:pStyle w:val="3"/>
+        <w:rPr>
+          <w:color w:val="0000FF"/>
+        </w:rPr>
+      </w:pPr>
+      <w:bookmarkStart w:id="258" w:name="_Toc204949549"/>
+      <w:bookmarkStart w:id="259" w:name="_Toc20450"/>
+      <w:bookmarkStart w:id="260" w:name="_Toc46909589"/>
+      <w:bookmarkStart w:id="261" w:name="_Toc172810467"/>
+      <w:bookmarkStart w:id="262" w:name="_Toc14345948"/>
+      <w:bookmarkStart w:id="263" w:name="_Toc507747281"/>
+      <w:r>
+        <w:rPr>
+          <w:color w:val="0000FF"/>
+        </w:rPr>
+        <w:t>9.5 VISÃO DA IMPLANTAÇÃO</w:t>
+      </w:r>
       <w:bookmarkEnd w:id="258"/>
       <w:bookmarkEnd w:id="259"/>
       <w:bookmarkEnd w:id="260"/>
+      <w:bookmarkEnd w:id="261"/>
+      <w:bookmarkEnd w:id="262"/>
+      <w:bookmarkEnd w:id="263"/>
     </w:p>
     <w:p>
       <w:pPr>
@@ -21390,11 +21904,11 @@
       <w:pPr>
         <w:pStyle w:val="2"/>
       </w:pPr>
-      <w:bookmarkStart w:id="261" w:name="_Toc20412"/>
+      <w:bookmarkStart w:id="264" w:name="_Toc20412"/>
       <w:r>
         <w:t>10 CONCLUSÃO</w:t>
       </w:r>
-      <w:bookmarkEnd w:id="261"/>
+      <w:bookmarkEnd w:id="264"/>
     </w:p>
     <w:p>
       <w:r>
@@ -21430,12 +21944,12 @@
       <w:pPr>
         <w:pStyle w:val="2"/>
       </w:pPr>
-      <w:bookmarkStart w:id="262" w:name="_Toc9004"/>
+      <w:bookmarkStart w:id="265" w:name="_Toc9004"/>
       <w:r>
         <w:t>REFERÊNCIAS</w:t>
       </w:r>
-      <w:bookmarkEnd w:id="76"/>
-      <w:bookmarkEnd w:id="262"/>
+      <w:bookmarkEnd w:id="79"/>
+      <w:bookmarkEnd w:id="265"/>
     </w:p>
     <w:p>
       <w:r>
@@ -21853,12 +22367,12 @@
       <w:r>
         <w:br w:type="page"/>
       </w:r>
-      <w:bookmarkStart w:id="263" w:name="_Toc21529"/>
-      <w:bookmarkStart w:id="264" w:name="_Toc192060120"/>
+      <w:bookmarkStart w:id="266" w:name="_Toc21529"/>
+      <w:bookmarkStart w:id="267" w:name="_Toc192060120"/>
       <w:r>
         <w:t>OBRAS CONSULTADAS</w:t>
       </w:r>
-      <w:bookmarkEnd w:id="263"/>
+      <w:bookmarkEnd w:id="266"/>
       <w:r>
         <w:t xml:space="preserve"> </w:t>
       </w:r>
@@ -22026,17 +22540,17 @@
       <w:r>
         <w:br w:type="page"/>
       </w:r>
-      <w:bookmarkEnd w:id="264"/>
-      <w:bookmarkStart w:id="265" w:name="_Toc192060121"/>
-      <w:bookmarkStart w:id="266" w:name="_Toc4870"/>
+      <w:bookmarkEnd w:id="267"/>
+      <w:bookmarkStart w:id="268" w:name="_Toc192060121"/>
+      <w:bookmarkStart w:id="269" w:name="_Toc4870"/>
       <w:r>
         <w:t>APÊNDICE</w:t>
       </w:r>
-      <w:bookmarkEnd w:id="265"/>
+      <w:bookmarkEnd w:id="268"/>
       <w:r>
         <w:t xml:space="preserve"> A – GERENCIAMENTO DO PROJETO</w:t>
       </w:r>
-      <w:bookmarkEnd w:id="266"/>
+      <w:bookmarkEnd w:id="269"/>
     </w:p>
     <w:p>
       <w:r>
@@ -22050,13 +22564,13 @@
       <w:r>
         <w:br w:type="page"/>
       </w:r>
-      <w:bookmarkStart w:id="267" w:name="_Toc9935"/>
-      <w:bookmarkStart w:id="268" w:name="_Toc284603410"/>
-      <w:bookmarkStart w:id="269" w:name="_Toc192060122"/>
+      <w:bookmarkStart w:id="270" w:name="_Toc9935"/>
+      <w:bookmarkStart w:id="271" w:name="_Toc284603410"/>
+      <w:bookmarkStart w:id="272" w:name="_Toc192060122"/>
       <w:r>
         <w:t>APÊNDICE B – RELATÓRIO DE DESEMPENHO</w:t>
       </w:r>
-      <w:bookmarkEnd w:id="267"/>
+      <w:bookmarkEnd w:id="270"/>
     </w:p>
     <w:p>
       <w:r>
@@ -22070,11 +22584,11 @@
       <w:r>
         <w:br w:type="page"/>
       </w:r>
-      <w:bookmarkStart w:id="270" w:name="_Toc26806"/>
+      <w:bookmarkStart w:id="273" w:name="_Toc26806"/>
       <w:r>
         <w:t>APÊNDICE C – VISÃO FUNCIONAL</w:t>
       </w:r>
-      <w:bookmarkEnd w:id="270"/>
+      <w:bookmarkEnd w:id="273"/>
     </w:p>
     <w:p>
       <w:r>
@@ -22088,11 +22602,11 @@
       <w:r>
         <w:br w:type="page"/>
       </w:r>
-      <w:bookmarkStart w:id="271" w:name="_Toc7785"/>
+      <w:bookmarkStart w:id="274" w:name="_Toc7785"/>
       <w:r>
         <w:t>APÊNDICE D – VISÃO DOS DADOS</w:t>
       </w:r>
-      <w:bookmarkEnd w:id="271"/>
+      <w:bookmarkEnd w:id="274"/>
     </w:p>
     <w:p>
       <w:r>
@@ -22108,11 +22622,11 @@
       <w:pPr>
         <w:pStyle w:val="2"/>
       </w:pPr>
-      <w:bookmarkStart w:id="272" w:name="_Toc29067"/>
+      <w:bookmarkStart w:id="275" w:name="_Toc29067"/>
       <w:r>
         <w:t>APÊNDICE E – MODELO INICIAL DA INTERFACE DE USUÁRIO</w:t>
       </w:r>
-      <w:bookmarkEnd w:id="272"/>
+      <w:bookmarkEnd w:id="275"/>
     </w:p>
     <w:p>
       <w:r>
@@ -22134,11 +22648,11 @@
       <w:pPr>
         <w:pStyle w:val="2"/>
       </w:pPr>
-      <w:bookmarkStart w:id="273" w:name="_Toc10275"/>
+      <w:bookmarkStart w:id="276" w:name="_Toc10275"/>
       <w:r>
         <w:t>APÊNDICE F – VISÕES ESTRUTURAL E COMPORTAMENTAL</w:t>
       </w:r>
-      <w:bookmarkEnd w:id="273"/>
+      <w:bookmarkEnd w:id="276"/>
     </w:p>
     <w:p>
       <w:r>
@@ -22161,18 +22675,18 @@
       <w:pPr>
         <w:pStyle w:val="2"/>
       </w:pPr>
-      <w:bookmarkStart w:id="274" w:name="_Toc3667"/>
+      <w:bookmarkStart w:id="277" w:name="_Toc3667"/>
       <w:r>
         <w:t>APÊNDICE G – ENTREVISTAS COM USUÁRIOS</w:t>
       </w:r>
-      <w:bookmarkEnd w:id="274"/>
+      <w:bookmarkEnd w:id="277"/>
     </w:p>
     <w:p>
       <w:r>
         <w:t>As entrevistas com os potenciais usuários do sistema encontram-se disponíveis na pasta “ApêndiceG” que acompanha este documento.</w:t>
       </w:r>
-      <w:bookmarkEnd w:id="268"/>
-      <w:bookmarkEnd w:id="269"/>
+      <w:bookmarkEnd w:id="271"/>
+      <w:bookmarkEnd w:id="272"/>
     </w:p>
     <w:p>
       <w:r>
@@ -22183,13 +22697,13 @@
       <w:pPr>
         <w:pStyle w:val="2"/>
       </w:pPr>
-      <w:bookmarkStart w:id="275" w:name="_Toc204949560"/>
-      <w:bookmarkStart w:id="276" w:name="_Toc12302"/>
+      <w:bookmarkStart w:id="278" w:name="_Toc12302"/>
+      <w:bookmarkStart w:id="279" w:name="_Toc204949560"/>
       <w:r>
         <w:t>APÊNDICE H – MODELO DE NEGÓCIO</w:t>
       </w:r>
-      <w:bookmarkEnd w:id="275"/>
-      <w:bookmarkEnd w:id="276"/>
+      <w:bookmarkEnd w:id="278"/>
+      <w:bookmarkEnd w:id="279"/>
     </w:p>
     <w:p>
       <w:r>
@@ -22205,17 +22719,17 @@
       <w:pPr>
         <w:pStyle w:val="2"/>
       </w:pPr>
-      <w:bookmarkStart w:id="277" w:name="_Toc204949561"/>
-      <w:bookmarkStart w:id="278" w:name="_Toc14185"/>
-      <w:bookmarkStart w:id="279" w:name="_Toc172810480"/>
+      <w:bookmarkStart w:id="280" w:name="_Toc204949561"/>
+      <w:bookmarkStart w:id="281" w:name="_Toc14185"/>
+      <w:bookmarkStart w:id="282" w:name="_Toc172810480"/>
       <w:r>
         <w:rPr>
           <w:caps w:val="0"/>
         </w:rPr>
         <w:t>APÊNDICE I – PROJETO DO SISTEMA DISTRIBUÍDO</w:t>
       </w:r>
-      <w:bookmarkEnd w:id="277"/>
-      <w:bookmarkEnd w:id="278"/>
+      <w:bookmarkEnd w:id="280"/>
+      <w:bookmarkEnd w:id="281"/>
     </w:p>
     <w:p>
       <w:r>
@@ -22241,38 +22755,38 @@
       <w:pPr>
         <w:pStyle w:val="2"/>
       </w:pPr>
-      <w:bookmarkStart w:id="280" w:name="_Toc204949562"/>
-      <w:bookmarkStart w:id="281" w:name="_Toc24418"/>
+      <w:bookmarkStart w:id="283" w:name="_Toc204949562"/>
+      <w:bookmarkStart w:id="284" w:name="_Toc24418"/>
       <w:r>
         <w:t>APÊNDICE J – CASOS DE TESTES</w:t>
-      </w:r>
-      <w:bookmarkEnd w:id="279"/>
-      <w:bookmarkEnd w:id="280"/>
-      <w:bookmarkEnd w:id="281"/>
-    </w:p>
-    <w:p>
-      <w:r>
-        <w:t>Os casos de testes e histórico de realização estão disponíveis na pasta “ApêndiceJ” que acompanha este documento.</w:t>
-      </w:r>
-    </w:p>
-    <w:p>
-      <w:r>
-        <w:br w:type="page"/>
-      </w:r>
-    </w:p>
-    <w:p>
-      <w:pPr>
-        <w:pStyle w:val="2"/>
-      </w:pPr>
-      <w:bookmarkStart w:id="282" w:name="_Toc204949563"/>
-      <w:bookmarkStart w:id="283" w:name="_Toc172810481"/>
-      <w:bookmarkStart w:id="284" w:name="_Toc25166"/>
-      <w:r>
-        <w:t>APÊNDICE K – RECURSOS DE APOIO À IMPLANTAÇÃO</w:t>
       </w:r>
       <w:bookmarkEnd w:id="282"/>
       <w:bookmarkEnd w:id="283"/>
       <w:bookmarkEnd w:id="284"/>
+    </w:p>
+    <w:p>
+      <w:r>
+        <w:t>Os casos de testes e histórico de realização estão disponíveis na pasta “ApêndiceJ” que acompanha este documento.</w:t>
+      </w:r>
+    </w:p>
+    <w:p>
+      <w:r>
+        <w:br w:type="page"/>
+      </w:r>
+    </w:p>
+    <w:p>
+      <w:pPr>
+        <w:pStyle w:val="2"/>
+      </w:pPr>
+      <w:bookmarkStart w:id="285" w:name="_Toc204949563"/>
+      <w:bookmarkStart w:id="286" w:name="_Toc25166"/>
+      <w:bookmarkStart w:id="287" w:name="_Toc172810481"/>
+      <w:r>
+        <w:t>APÊNDICE K – RECURSOS DE APOIO À IMPLANTAÇÃO</w:t>
+      </w:r>
+      <w:bookmarkEnd w:id="285"/>
+      <w:bookmarkEnd w:id="286"/>
+      <w:bookmarkEnd w:id="287"/>
     </w:p>
     <w:p>
       <w:r>
@@ -23363,7 +23877,7 @@
     <w:lsdException w:uiPriority="99" w:name="HTML Sample"/>
     <w:lsdException w:uiPriority="99" w:name="HTML Typewriter"/>
     <w:lsdException w:uiPriority="99" w:name="HTML Variable"/>
-    <w:lsdException w:uiPriority="99" w:name="Normal Table"/>
+    <w:lsdException w:qFormat="1" w:uiPriority="99" w:name="Normal Table"/>
     <w:lsdException w:uiPriority="99" w:name="annotation subject"/>
     <w:lsdException w:uiPriority="99" w:name="Table Simple 1"/>
     <w:lsdException w:uiPriority="99" w:name="Table Simple 2"/>
@@ -23511,6 +24025,7 @@
     <w:name w:val="Normal Table"/>
     <w:semiHidden/>
     <w:unhideWhenUsed/>
+    <w:qFormat/>
     <w:uiPriority w:val="99"/>
     <w:tblPr>
       <w:tblCellMar>

</xml_diff>